<commit_message>
Threshold Alignment: depth label architecture + boolean+angle logic
Two separate label systems confirmed:
- Biomechanics script + OpenCV image: 3 labels (Excellent/Good/Warning)
  Side: ≤70° Excellent, 71-90° Good, >90° Warning (all MediaPipe interior)
  Front: ≤90° Excellent, 91-105° Good, >105° Warning
- MD coaching reference: 5-grade system unchanged — used by LLM only

Depth classification logic agreed:
- Step 1 (boolean): hip_y < knee_y → depth_achieved (hip below knee)
  Camera-agnostic, most accurate, drives Warning vs not-Warning split
- Step 2 (grade): knee_angle_at_bottom → Excellent vs Good
  Side ≤70° = Excellent, 71-90° = Good
  Front ≤90° = Excellent, 91-105° = Good

depth_classification field outputs: 'Excellent' | 'Good' | 'Warning'
depth_insufficient_flag: True when Warning (hip above knee)

Co-Authored-By: Claude Sonnet 4.6 <noreply@anthropic.com>
</commit_message>
<xml_diff>
--- a/Kinetic_Threshold_Alignment.docx
+++ b/Kinetic_Threshold_Alignment.docx
@@ -11361,6 +11361,1528 @@
           <w:sz w:val="16"/>
         </w:rPr>
         <w:t>Kinetic  ·  Threshold Alignment Brief  ·  Depth Classification  ·  v0.1  ·  May 2026</w:t>
+      </w:r>
+    </w:p>
+    <w:p>
+      <w:r>
+        <w:br w:type="page"/>
+      </w:r>
+    </w:p>
+    <w:p>
+      <w:r>
+        <w:rPr>
+          <w:rFonts w:ascii="Calibri" w:hAnsi="Calibri"/>
+          <w:b/>
+          <w:i w:val="0"/>
+          <w:color w:val="0F274D"/>
+          <w:sz w:val="36"/>
+        </w:rPr>
+        <w:t>Kinetic — Threshold Alignment Brief</w:t>
+      </w:r>
+    </w:p>
+    <w:p>
+      <w:pPr>
+        <w:spacing w:after="80"/>
+      </w:pPr>
+      <w:r>
+        <w:rPr>
+          <w:rFonts w:ascii="Calibri" w:hAnsi="Calibri"/>
+          <w:b w:val="0"/>
+          <w:i w:val="0"/>
+          <w:color w:val="555555"/>
+          <w:sz w:val="18"/>
+        </w:rPr>
+        <w:t>Depth Classification — Label Architecture Clarification  ·  May 2026</w:t>
+      </w:r>
+    </w:p>
+    <w:p>
+      <w:pPr>
+        <w:spacing w:before="120" w:after="120"/>
+        <w:pBdr>
+          <w:bottom w:val="single" w:sz="6" w:space="1" w:color="1E5BA8"/>
+        </w:pBdr>
+      </w:pPr>
+    </w:p>
+    <w:p>
+      <w:pPr>
+        <w:spacing w:before="200" w:after="60"/>
+      </w:pPr>
+      <w:r>
+        <w:rPr>
+          <w:rFonts w:ascii="Calibri" w:hAnsi="Calibri"/>
+          <w:b/>
+          <w:i w:val="0"/>
+          <w:color w:val="1E5BA8"/>
+          <w:sz w:val="24"/>
+        </w:rPr>
+        <w:t>Two separate label systems — confirmed</w:t>
+      </w:r>
+    </w:p>
+    <w:tbl>
+      <w:tblPr>
+        <w:tblStyle w:val="TableGrid"/>
+        <w:tblW w:type="auto" w:w="0"/>
+        <w:tblLook w:firstColumn="1" w:firstRow="1" w:lastColumn="0" w:lastRow="0" w:noHBand="0" w:noVBand="1" w:val="04A0"/>
+      </w:tblPr>
+      <w:tblGrid>
+        <w:gridCol w:w="9746"/>
+      </w:tblGrid>
+      <w:tr>
+        <w:tc>
+          <w:tcPr>
+            <w:tcW w:type="dxa" w:w="9746"/>
+            <w:shd w:val="clear" w:color="auto" w:fill="E8F0FE"/>
+            <w:tcBorders>
+              <w:top w:val="single" w:sz="6" w:space="0" w:color="AAAAAA"/>
+              <w:left w:val="single" w:sz="6" w:space="0" w:color="AAAAAA"/>
+              <w:bottom w:val="single" w:sz="6" w:space="0" w:color="AAAAAA"/>
+              <w:right w:val="single" w:sz="6" w:space="0" w:color="AAAAAA"/>
+            </w:tcBorders>
+          </w:tcPr>
+          <w:p>
+            <w:pPr>
+              <w:spacing w:before="40" w:after="40"/>
+            </w:pPr>
+            <w:r>
+              <w:rPr>
+                <w:rFonts w:ascii="Calibri" w:hAnsi="Calibri"/>
+                <w:b/>
+                <w:i w:val="0"/>
+                <w:color w:val="1E5BA8"/>
+                <w:sz w:val="20"/>
+              </w:rPr>
+              <w:t xml:space="preserve">Key decision:  </w:t>
+            </w:r>
+            <w:r>
+              <w:rPr>
+                <w:rFonts w:ascii="Calibri" w:hAnsi="Calibri"/>
+                <w:b w:val="0"/>
+                <w:i w:val="0"/>
+                <w:color w:val="1C1C1C"/>
+                <w:sz w:val="20"/>
+              </w:rPr>
+              <w:t>The biomechanics script + OpenCV image overlay use a simplified 3-label system for display to the user. The MD coaching reference retains its full 5-grade system for the LLM's scoring and coaching language. These two systems are independent — they do not need to match.</w:t>
+            </w:r>
+          </w:p>
+        </w:tc>
+      </w:tr>
+    </w:tbl>
+    <w:p>
+      <w:pPr>
+        <w:spacing w:after="80"/>
+      </w:pPr>
+    </w:p>
+    <w:p>
+      <w:pPr>
+        <w:spacing w:before="20" w:after="80"/>
+      </w:pPr>
+      <w:r>
+        <w:rPr>
+          <w:rFonts w:ascii="Calibri" w:hAnsi="Calibri"/>
+          <w:b w:val="0"/>
+          <w:i w:val="0"/>
+          <w:color w:val="1C1C1C"/>
+          <w:sz w:val="20"/>
+        </w:rPr>
+        <w:t>System 1 — Biomechanics script  +  OpenCV annotated image overlay:</w:t>
+      </w:r>
+    </w:p>
+    <w:tbl>
+      <w:tblPr>
+        <w:tblStyle w:val="TableGrid"/>
+        <w:tblW w:type="auto" w:w="0"/>
+        <w:tblLook w:firstColumn="1" w:firstRow="1" w:lastColumn="0" w:lastRow="0" w:noHBand="0" w:noVBand="1" w:val="04A0"/>
+      </w:tblPr>
+      <w:tblGrid>
+        <w:gridCol w:w="1949"/>
+        <w:gridCol w:w="1949"/>
+        <w:gridCol w:w="1949"/>
+        <w:gridCol w:w="1949"/>
+        <w:gridCol w:w="1949"/>
+      </w:tblGrid>
+      <w:tr>
+        <w:tc>
+          <w:tcPr>
+            <w:tcW w:type="dxa" w:w="1587"/>
+            <w:shd w:val="clear" w:color="auto" w:fill="0F274D"/>
+            <w:tcBorders>
+              <w:top w:val="single" w:sz="4" w:space="0" w:color="FFFFFF"/>
+              <w:left w:val="single" w:sz="4" w:space="0" w:color="FFFFFF"/>
+              <w:bottom w:val="single" w:sz="4" w:space="0" w:color="FFFFFF"/>
+              <w:right w:val="single" w:sz="4" w:space="0" w:color="FFFFFF"/>
+            </w:tcBorders>
+          </w:tcPr>
+          <w:p>
+            <w:pPr>
+              <w:jc w:val="center"/>
+            </w:pPr>
+            <w:r>
+              <w:rPr>
+                <w:rFonts w:ascii="Calibri" w:hAnsi="Calibri"/>
+                <w:b/>
+                <w:i w:val="0"/>
+                <w:color w:val="FFFFFF"/>
+                <w:sz w:val="18"/>
+              </w:rPr>
+              <w:t>Label shown on image</w:t>
+            </w:r>
+          </w:p>
+        </w:tc>
+        <w:tc>
+          <w:tcPr>
+            <w:tcW w:type="dxa" w:w="2551"/>
+            <w:shd w:val="clear" w:color="auto" w:fill="0F274D"/>
+            <w:tcBorders>
+              <w:top w:val="single" w:sz="4" w:space="0" w:color="FFFFFF"/>
+              <w:left w:val="single" w:sz="4" w:space="0" w:color="FFFFFF"/>
+              <w:bottom w:val="single" w:sz="4" w:space="0" w:color="FFFFFF"/>
+              <w:right w:val="single" w:sz="4" w:space="0" w:color="FFFFFF"/>
+            </w:tcBorders>
+          </w:tcPr>
+          <w:p>
+            <w:pPr>
+              <w:jc w:val="center"/>
+            </w:pPr>
+            <w:r>
+              <w:rPr>
+                <w:rFonts w:ascii="Calibri" w:hAnsi="Calibri"/>
+                <w:b/>
+                <w:i w:val="0"/>
+                <w:color w:val="FFFFFF"/>
+                <w:sz w:val="18"/>
+              </w:rPr>
+              <w:t>Applies to</w:t>
+            </w:r>
+          </w:p>
+        </w:tc>
+        <w:tc>
+          <w:tcPr>
+            <w:tcW w:type="dxa" w:w="2154"/>
+            <w:shd w:val="clear" w:color="auto" w:fill="0F274D"/>
+            <w:tcBorders>
+              <w:top w:val="single" w:sz="4" w:space="0" w:color="FFFFFF"/>
+              <w:left w:val="single" w:sz="4" w:space="0" w:color="FFFFFF"/>
+              <w:bottom w:val="single" w:sz="4" w:space="0" w:color="FFFFFF"/>
+              <w:right w:val="single" w:sz="4" w:space="0" w:color="FFFFFF"/>
+            </w:tcBorders>
+          </w:tcPr>
+          <w:p>
+            <w:pPr>
+              <w:jc w:val="center"/>
+            </w:pPr>
+            <w:r>
+              <w:rPr>
+                <w:rFonts w:ascii="Calibri" w:hAnsi="Calibri"/>
+                <w:b/>
+                <w:i w:val="0"/>
+                <w:color w:val="FFFFFF"/>
+                <w:sz w:val="18"/>
+              </w:rPr>
+              <w:t>Knee angle — Side camera</w:t>
+              <w:br/>
+              <w:t>(MediaPipe interior)</w:t>
+            </w:r>
+          </w:p>
+        </w:tc>
+        <w:tc>
+          <w:tcPr>
+            <w:tcW w:type="dxa" w:w="2154"/>
+            <w:shd w:val="clear" w:color="auto" w:fill="0F274D"/>
+            <w:tcBorders>
+              <w:top w:val="single" w:sz="4" w:space="0" w:color="FFFFFF"/>
+              <w:left w:val="single" w:sz="4" w:space="0" w:color="FFFFFF"/>
+              <w:bottom w:val="single" w:sz="4" w:space="0" w:color="FFFFFF"/>
+              <w:right w:val="single" w:sz="4" w:space="0" w:color="FFFFFF"/>
+            </w:tcBorders>
+          </w:tcPr>
+          <w:p>
+            <w:pPr>
+              <w:jc w:val="center"/>
+            </w:pPr>
+            <w:r>
+              <w:rPr>
+                <w:rFonts w:ascii="Calibri" w:hAnsi="Calibri"/>
+                <w:b/>
+                <w:i w:val="0"/>
+                <w:color w:val="FFFFFF"/>
+                <w:sz w:val="18"/>
+              </w:rPr>
+              <w:t>Knee angle — Front camera</w:t>
+              <w:br/>
+              <w:t>(MediaPipe interior)</w:t>
+            </w:r>
+          </w:p>
+        </w:tc>
+        <w:tc>
+          <w:tcPr>
+            <w:tcW w:type="dxa" w:w="2268"/>
+            <w:shd w:val="clear" w:color="auto" w:fill="0F274D"/>
+            <w:tcBorders>
+              <w:top w:val="single" w:sz="4" w:space="0" w:color="FFFFFF"/>
+              <w:left w:val="single" w:sz="4" w:space="0" w:color="FFFFFF"/>
+              <w:bottom w:val="single" w:sz="4" w:space="0" w:color="FFFFFF"/>
+              <w:right w:val="single" w:sz="4" w:space="0" w:color="FFFFFF"/>
+            </w:tcBorders>
+          </w:tcPr>
+          <w:p>
+            <w:pPr>
+              <w:jc w:val="center"/>
+            </w:pPr>
+            <w:r>
+              <w:rPr>
+                <w:rFonts w:ascii="Calibri" w:hAnsi="Calibri"/>
+                <w:b/>
+                <w:i w:val="0"/>
+                <w:color w:val="FFFFFF"/>
+                <w:sz w:val="18"/>
+              </w:rPr>
+              <w:t>Hip position</w:t>
+            </w:r>
+          </w:p>
+        </w:tc>
+      </w:tr>
+      <w:tr>
+        <w:tc>
+          <w:tcPr>
+            <w:tcW w:type="dxa" w:w="1587"/>
+            <w:shd w:val="clear" w:color="auto" w:fill="E0F4E8"/>
+            <w:tcBorders>
+              <w:top w:val="single" w:sz="4" w:space="0" w:color="CCCCCC"/>
+              <w:left w:val="single" w:sz="4" w:space="0" w:color="CCCCCC"/>
+              <w:bottom w:val="single" w:sz="4" w:space="0" w:color="CCCCCC"/>
+              <w:right w:val="single" w:sz="4" w:space="0" w:color="CCCCCC"/>
+            </w:tcBorders>
+          </w:tcPr>
+          <w:p>
+            <w:pPr>
+              <w:jc w:val="left"/>
+            </w:pPr>
+            <w:r>
+              <w:rPr>
+                <w:rFonts w:ascii="Calibri" w:hAnsi="Calibri"/>
+                <w:b w:val="0"/>
+                <w:i w:val="0"/>
+                <w:color w:val="1A6E2E"/>
+                <w:sz w:val="18"/>
+              </w:rPr>
+              <w:t>Excellent</w:t>
+            </w:r>
+          </w:p>
+        </w:tc>
+        <w:tc>
+          <w:tcPr>
+            <w:tcW w:type="dxa" w:w="2551"/>
+            <w:tcBorders>
+              <w:top w:val="single" w:sz="4" w:space="0" w:color="CCCCCC"/>
+              <w:left w:val="single" w:sz="4" w:space="0" w:color="CCCCCC"/>
+              <w:bottom w:val="single" w:sz="4" w:space="0" w:color="CCCCCC"/>
+              <w:right w:val="single" w:sz="4" w:space="0" w:color="CCCCCC"/>
+            </w:tcBorders>
+          </w:tcPr>
+          <w:p>
+            <w:pPr>
+              <w:jc w:val="left"/>
+            </w:pPr>
+            <w:r>
+              <w:rPr>
+                <w:rFonts w:ascii="Calibri" w:hAnsi="Calibri"/>
+                <w:b w:val="0"/>
+                <w:i w:val="0"/>
+                <w:color w:val="1C1C1C"/>
+                <w:sz w:val="18"/>
+              </w:rPr>
+              <w:t>Script depth_classification field + OpenCV image</w:t>
+            </w:r>
+          </w:p>
+        </w:tc>
+        <w:tc>
+          <w:tcPr>
+            <w:tcW w:type="dxa" w:w="2154"/>
+            <w:tcBorders>
+              <w:top w:val="single" w:sz="4" w:space="0" w:color="CCCCCC"/>
+              <w:left w:val="single" w:sz="4" w:space="0" w:color="CCCCCC"/>
+              <w:bottom w:val="single" w:sz="4" w:space="0" w:color="CCCCCC"/>
+              <w:right w:val="single" w:sz="4" w:space="0" w:color="CCCCCC"/>
+            </w:tcBorders>
+          </w:tcPr>
+          <w:p>
+            <w:pPr>
+              <w:jc w:val="left"/>
+            </w:pPr>
+            <w:r>
+              <w:rPr>
+                <w:rFonts w:ascii="Calibri" w:hAnsi="Calibri"/>
+                <w:b w:val="0"/>
+                <w:i w:val="0"/>
+                <w:color w:val="1A6E2E"/>
+                <w:sz w:val="18"/>
+              </w:rPr>
+              <w:t>≤ 70°</w:t>
+            </w:r>
+          </w:p>
+        </w:tc>
+        <w:tc>
+          <w:tcPr>
+            <w:tcW w:type="dxa" w:w="2154"/>
+            <w:tcBorders>
+              <w:top w:val="single" w:sz="4" w:space="0" w:color="CCCCCC"/>
+              <w:left w:val="single" w:sz="4" w:space="0" w:color="CCCCCC"/>
+              <w:bottom w:val="single" w:sz="4" w:space="0" w:color="CCCCCC"/>
+              <w:right w:val="single" w:sz="4" w:space="0" w:color="CCCCCC"/>
+            </w:tcBorders>
+          </w:tcPr>
+          <w:p>
+            <w:pPr>
+              <w:jc w:val="left"/>
+            </w:pPr>
+            <w:r>
+              <w:rPr>
+                <w:rFonts w:ascii="Calibri" w:hAnsi="Calibri"/>
+                <w:b w:val="0"/>
+                <w:i w:val="0"/>
+                <w:color w:val="1A6E2E"/>
+                <w:sz w:val="18"/>
+              </w:rPr>
+              <w:t>≤ 90°</w:t>
+            </w:r>
+          </w:p>
+        </w:tc>
+        <w:tc>
+          <w:tcPr>
+            <w:tcW w:type="dxa" w:w="2268"/>
+            <w:tcBorders>
+              <w:top w:val="single" w:sz="4" w:space="0" w:color="CCCCCC"/>
+              <w:left w:val="single" w:sz="4" w:space="0" w:color="CCCCCC"/>
+              <w:bottom w:val="single" w:sz="4" w:space="0" w:color="CCCCCC"/>
+              <w:right w:val="single" w:sz="4" w:space="0" w:color="CCCCCC"/>
+            </w:tcBorders>
+          </w:tcPr>
+          <w:p>
+            <w:pPr>
+              <w:jc w:val="left"/>
+            </w:pPr>
+            <w:r>
+              <w:rPr>
+                <w:rFonts w:ascii="Calibri" w:hAnsi="Calibri"/>
+                <w:b w:val="0"/>
+                <w:i w:val="0"/>
+                <w:color w:val="1C1C1C"/>
+                <w:sz w:val="18"/>
+              </w:rPr>
+              <w:t>Hip well below knee — full depth</w:t>
+            </w:r>
+          </w:p>
+        </w:tc>
+      </w:tr>
+      <w:tr>
+        <w:tc>
+          <w:tcPr>
+            <w:tcW w:type="dxa" w:w="1587"/>
+            <w:shd w:val="clear" w:color="auto" w:fill="E0F4E8"/>
+            <w:tcBorders>
+              <w:top w:val="single" w:sz="4" w:space="0" w:color="CCCCCC"/>
+              <w:left w:val="single" w:sz="4" w:space="0" w:color="CCCCCC"/>
+              <w:bottom w:val="single" w:sz="4" w:space="0" w:color="CCCCCC"/>
+              <w:right w:val="single" w:sz="4" w:space="0" w:color="CCCCCC"/>
+            </w:tcBorders>
+          </w:tcPr>
+          <w:p>
+            <w:pPr>
+              <w:jc w:val="left"/>
+            </w:pPr>
+            <w:r>
+              <w:rPr>
+                <w:rFonts w:ascii="Calibri" w:hAnsi="Calibri"/>
+                <w:b w:val="0"/>
+                <w:i w:val="0"/>
+                <w:color w:val="1A6E2E"/>
+                <w:sz w:val="18"/>
+              </w:rPr>
+              <w:t>Good</w:t>
+            </w:r>
+          </w:p>
+        </w:tc>
+        <w:tc>
+          <w:tcPr>
+            <w:tcW w:type="dxa" w:w="2551"/>
+            <w:tcBorders>
+              <w:top w:val="single" w:sz="4" w:space="0" w:color="CCCCCC"/>
+              <w:left w:val="single" w:sz="4" w:space="0" w:color="CCCCCC"/>
+              <w:bottom w:val="single" w:sz="4" w:space="0" w:color="CCCCCC"/>
+              <w:right w:val="single" w:sz="4" w:space="0" w:color="CCCCCC"/>
+            </w:tcBorders>
+          </w:tcPr>
+          <w:p>
+            <w:pPr>
+              <w:jc w:val="left"/>
+            </w:pPr>
+            <w:r>
+              <w:rPr>
+                <w:rFonts w:ascii="Calibri" w:hAnsi="Calibri"/>
+                <w:b w:val="0"/>
+                <w:i w:val="0"/>
+                <w:color w:val="1C1C1C"/>
+                <w:sz w:val="18"/>
+              </w:rPr>
+              <w:t>Script depth_classification field + OpenCV image</w:t>
+            </w:r>
+          </w:p>
+        </w:tc>
+        <w:tc>
+          <w:tcPr>
+            <w:tcW w:type="dxa" w:w="2154"/>
+            <w:tcBorders>
+              <w:top w:val="single" w:sz="4" w:space="0" w:color="CCCCCC"/>
+              <w:left w:val="single" w:sz="4" w:space="0" w:color="CCCCCC"/>
+              <w:bottom w:val="single" w:sz="4" w:space="0" w:color="CCCCCC"/>
+              <w:right w:val="single" w:sz="4" w:space="0" w:color="CCCCCC"/>
+            </w:tcBorders>
+          </w:tcPr>
+          <w:p>
+            <w:pPr>
+              <w:jc w:val="left"/>
+            </w:pPr>
+            <w:r>
+              <w:rPr>
+                <w:rFonts w:ascii="Calibri" w:hAnsi="Calibri"/>
+                <w:b w:val="0"/>
+                <w:i w:val="0"/>
+                <w:color w:val="1A6E2E"/>
+                <w:sz w:val="18"/>
+              </w:rPr>
+              <w:t>71–90°</w:t>
+            </w:r>
+          </w:p>
+        </w:tc>
+        <w:tc>
+          <w:tcPr>
+            <w:tcW w:type="dxa" w:w="2154"/>
+            <w:tcBorders>
+              <w:top w:val="single" w:sz="4" w:space="0" w:color="CCCCCC"/>
+              <w:left w:val="single" w:sz="4" w:space="0" w:color="CCCCCC"/>
+              <w:bottom w:val="single" w:sz="4" w:space="0" w:color="CCCCCC"/>
+              <w:right w:val="single" w:sz="4" w:space="0" w:color="CCCCCC"/>
+            </w:tcBorders>
+          </w:tcPr>
+          <w:p>
+            <w:pPr>
+              <w:jc w:val="left"/>
+            </w:pPr>
+            <w:r>
+              <w:rPr>
+                <w:rFonts w:ascii="Calibri" w:hAnsi="Calibri"/>
+                <w:b w:val="0"/>
+                <w:i w:val="0"/>
+                <w:color w:val="1A6E2E"/>
+                <w:sz w:val="18"/>
+              </w:rPr>
+              <w:t>91–105°</w:t>
+            </w:r>
+          </w:p>
+        </w:tc>
+        <w:tc>
+          <w:tcPr>
+            <w:tcW w:type="dxa" w:w="2268"/>
+            <w:tcBorders>
+              <w:top w:val="single" w:sz="4" w:space="0" w:color="CCCCCC"/>
+              <w:left w:val="single" w:sz="4" w:space="0" w:color="CCCCCC"/>
+              <w:bottom w:val="single" w:sz="4" w:space="0" w:color="CCCCCC"/>
+              <w:right w:val="single" w:sz="4" w:space="0" w:color="CCCCCC"/>
+            </w:tcBorders>
+          </w:tcPr>
+          <w:p>
+            <w:pPr>
+              <w:jc w:val="left"/>
+            </w:pPr>
+            <w:r>
+              <w:rPr>
+                <w:rFonts w:ascii="Calibri" w:hAnsi="Calibri"/>
+                <w:b w:val="0"/>
+                <w:i w:val="0"/>
+                <w:color w:val="1C1C1C"/>
+                <w:sz w:val="18"/>
+              </w:rPr>
+              <w:t>Hip at or just below knee</w:t>
+            </w:r>
+          </w:p>
+        </w:tc>
+      </w:tr>
+      <w:tr>
+        <w:tc>
+          <w:tcPr>
+            <w:tcW w:type="dxa" w:w="1587"/>
+            <w:shd w:val="clear" w:color="auto" w:fill="F8D0D0"/>
+            <w:tcBorders>
+              <w:top w:val="single" w:sz="4" w:space="0" w:color="CCCCCC"/>
+              <w:left w:val="single" w:sz="4" w:space="0" w:color="CCCCCC"/>
+              <w:bottom w:val="single" w:sz="4" w:space="0" w:color="CCCCCC"/>
+              <w:right w:val="single" w:sz="4" w:space="0" w:color="CCCCCC"/>
+            </w:tcBorders>
+          </w:tcPr>
+          <w:p>
+            <w:pPr>
+              <w:jc w:val="left"/>
+            </w:pPr>
+            <w:r>
+              <w:rPr>
+                <w:rFonts w:ascii="Calibri" w:hAnsi="Calibri"/>
+                <w:b w:val="0"/>
+                <w:i w:val="0"/>
+                <w:color w:val="C02020"/>
+                <w:sz w:val="18"/>
+              </w:rPr>
+              <w:t>Warning</w:t>
+            </w:r>
+          </w:p>
+        </w:tc>
+        <w:tc>
+          <w:tcPr>
+            <w:tcW w:type="dxa" w:w="2551"/>
+            <w:tcBorders>
+              <w:top w:val="single" w:sz="4" w:space="0" w:color="CCCCCC"/>
+              <w:left w:val="single" w:sz="4" w:space="0" w:color="CCCCCC"/>
+              <w:bottom w:val="single" w:sz="4" w:space="0" w:color="CCCCCC"/>
+              <w:right w:val="single" w:sz="4" w:space="0" w:color="CCCCCC"/>
+            </w:tcBorders>
+          </w:tcPr>
+          <w:p>
+            <w:pPr>
+              <w:jc w:val="left"/>
+            </w:pPr>
+            <w:r>
+              <w:rPr>
+                <w:rFonts w:ascii="Calibri" w:hAnsi="Calibri"/>
+                <w:b w:val="0"/>
+                <w:i w:val="0"/>
+                <w:color w:val="1C1C1C"/>
+                <w:sz w:val="18"/>
+              </w:rPr>
+              <w:t>Script depth_classification field + OpenCV image</w:t>
+            </w:r>
+          </w:p>
+        </w:tc>
+        <w:tc>
+          <w:tcPr>
+            <w:tcW w:type="dxa" w:w="2154"/>
+            <w:tcBorders>
+              <w:top w:val="single" w:sz="4" w:space="0" w:color="CCCCCC"/>
+              <w:left w:val="single" w:sz="4" w:space="0" w:color="CCCCCC"/>
+              <w:bottom w:val="single" w:sz="4" w:space="0" w:color="CCCCCC"/>
+              <w:right w:val="single" w:sz="4" w:space="0" w:color="CCCCCC"/>
+            </w:tcBorders>
+          </w:tcPr>
+          <w:p>
+            <w:pPr>
+              <w:jc w:val="left"/>
+            </w:pPr>
+            <w:r>
+              <w:rPr>
+                <w:rFonts w:ascii="Calibri" w:hAnsi="Calibri"/>
+                <w:b w:val="0"/>
+                <w:i w:val="0"/>
+                <w:color w:val="C02020"/>
+                <w:sz w:val="18"/>
+              </w:rPr>
+              <w:t>&gt; 90°</w:t>
+            </w:r>
+          </w:p>
+        </w:tc>
+        <w:tc>
+          <w:tcPr>
+            <w:tcW w:type="dxa" w:w="2154"/>
+            <w:tcBorders>
+              <w:top w:val="single" w:sz="4" w:space="0" w:color="CCCCCC"/>
+              <w:left w:val="single" w:sz="4" w:space="0" w:color="CCCCCC"/>
+              <w:bottom w:val="single" w:sz="4" w:space="0" w:color="CCCCCC"/>
+              <w:right w:val="single" w:sz="4" w:space="0" w:color="CCCCCC"/>
+            </w:tcBorders>
+          </w:tcPr>
+          <w:p>
+            <w:pPr>
+              <w:jc w:val="left"/>
+            </w:pPr>
+            <w:r>
+              <w:rPr>
+                <w:rFonts w:ascii="Calibri" w:hAnsi="Calibri"/>
+                <w:b w:val="0"/>
+                <w:i w:val="0"/>
+                <w:color w:val="C02020"/>
+                <w:sz w:val="18"/>
+              </w:rPr>
+              <w:t>&gt; 105°</w:t>
+            </w:r>
+          </w:p>
+        </w:tc>
+        <w:tc>
+          <w:tcPr>
+            <w:tcW w:type="dxa" w:w="2268"/>
+            <w:tcBorders>
+              <w:top w:val="single" w:sz="4" w:space="0" w:color="CCCCCC"/>
+              <w:left w:val="single" w:sz="4" w:space="0" w:color="CCCCCC"/>
+              <w:bottom w:val="single" w:sz="4" w:space="0" w:color="CCCCCC"/>
+              <w:right w:val="single" w:sz="4" w:space="0" w:color="CCCCCC"/>
+            </w:tcBorders>
+          </w:tcPr>
+          <w:p>
+            <w:pPr>
+              <w:jc w:val="left"/>
+            </w:pPr>
+            <w:r>
+              <w:rPr>
+                <w:rFonts w:ascii="Calibri" w:hAnsi="Calibri"/>
+                <w:b w:val="0"/>
+                <w:i w:val="0"/>
+                <w:color w:val="1C1C1C"/>
+                <w:sz w:val="18"/>
+              </w:rPr>
+              <w:t>Hip above knee — not deep enough</w:t>
+            </w:r>
+          </w:p>
+        </w:tc>
+      </w:tr>
+    </w:tbl>
+    <w:p>
+      <w:pPr>
+        <w:spacing w:after="80"/>
+      </w:pPr>
+    </w:p>
+    <w:tbl>
+      <w:tblPr>
+        <w:tblStyle w:val="TableGrid"/>
+        <w:tblW w:type="auto" w:w="0"/>
+        <w:tblLook w:firstColumn="1" w:firstRow="1" w:lastColumn="0" w:lastRow="0" w:noHBand="0" w:noVBand="1" w:val="04A0"/>
+      </w:tblPr>
+      <w:tblGrid>
+        <w:gridCol w:w="9746"/>
+      </w:tblGrid>
+      <w:tr>
+        <w:tc>
+          <w:tcPr>
+            <w:tcW w:type="dxa" w:w="9746"/>
+            <w:shd w:val="clear" w:color="auto" w:fill="FFF3CD"/>
+            <w:tcBorders>
+              <w:top w:val="single" w:sz="6" w:space="0" w:color="AAAAAA"/>
+              <w:left w:val="single" w:sz="6" w:space="0" w:color="AAAAAA"/>
+              <w:bottom w:val="single" w:sz="6" w:space="0" w:color="AAAAAA"/>
+              <w:right w:val="single" w:sz="6" w:space="0" w:color="AAAAAA"/>
+            </w:tcBorders>
+          </w:tcPr>
+          <w:p>
+            <w:pPr>
+              <w:spacing w:before="40" w:after="40"/>
+            </w:pPr>
+            <w:r>
+              <w:rPr>
+                <w:rFonts w:ascii="Calibri" w:hAnsi="Calibri"/>
+                <w:b/>
+                <w:i w:val="0"/>
+                <w:color w:val="C07000"/>
+                <w:sz w:val="20"/>
+              </w:rPr>
+              <w:t xml:space="preserve">Note:  </w:t>
+            </w:r>
+            <w:r>
+              <w:rPr>
+                <w:rFonts w:ascii="Calibri" w:hAnsi="Calibri"/>
+                <w:b w:val="0"/>
+                <w:i w:val="0"/>
+                <w:color w:val="1C1C1C"/>
+                <w:sz w:val="20"/>
+              </w:rPr>
+              <w:t>All angles are MediaPipe interior convention — smaller = more deeply bent. Warning = everything above parallel regardless of how far above. Excellent + Good = depth achieved. Warning = depth not achieved.</w:t>
+            </w:r>
+          </w:p>
+        </w:tc>
+      </w:tr>
+    </w:tbl>
+    <w:p>
+      <w:pPr>
+        <w:spacing w:after="80"/>
+      </w:pPr>
+    </w:p>
+    <w:p>
+      <w:pPr>
+        <w:spacing w:before="20" w:after="80"/>
+      </w:pPr>
+      <w:r>
+        <w:rPr>
+          <w:rFonts w:ascii="Calibri" w:hAnsi="Calibri"/>
+          <w:b w:val="0"/>
+          <w:i w:val="0"/>
+          <w:color w:val="1C1C1C"/>
+          <w:sz w:val="20"/>
+        </w:rPr>
+        <w:t>System 2 — MD coaching reference (goblet_squat_coaching_reference.md) — unchanged:</w:t>
+      </w:r>
+    </w:p>
+    <w:tbl>
+      <w:tblPr>
+        <w:tblStyle w:val="TableGrid"/>
+        <w:tblW w:type="auto" w:w="0"/>
+        <w:tblLook w:firstColumn="1" w:firstRow="1" w:lastColumn="0" w:lastRow="0" w:noHBand="0" w:noVBand="1" w:val="04A0"/>
+      </w:tblPr>
+      <w:tblGrid>
+        <w:gridCol w:w="2436"/>
+        <w:gridCol w:w="2436"/>
+        <w:gridCol w:w="2436"/>
+        <w:gridCol w:w="2436"/>
+      </w:tblGrid>
+      <w:tr>
+        <w:tc>
+          <w:tcPr>
+            <w:tcW w:type="dxa" w:w="1587"/>
+            <w:shd w:val="clear" w:color="auto" w:fill="0F274D"/>
+            <w:tcBorders>
+              <w:top w:val="single" w:sz="4" w:space="0" w:color="FFFFFF"/>
+              <w:left w:val="single" w:sz="4" w:space="0" w:color="FFFFFF"/>
+              <w:bottom w:val="single" w:sz="4" w:space="0" w:color="FFFFFF"/>
+              <w:right w:val="single" w:sz="4" w:space="0" w:color="FFFFFF"/>
+            </w:tcBorders>
+          </w:tcPr>
+          <w:p>
+            <w:pPr>
+              <w:jc w:val="center"/>
+            </w:pPr>
+            <w:r>
+              <w:rPr>
+                <w:rFonts w:ascii="Calibri" w:hAnsi="Calibri"/>
+                <w:b/>
+                <w:i w:val="0"/>
+                <w:color w:val="FFFFFF"/>
+                <w:sz w:val="18"/>
+              </w:rPr>
+              <w:t>MD grade</w:t>
+            </w:r>
+          </w:p>
+        </w:tc>
+        <w:tc>
+          <w:tcPr>
+            <w:tcW w:type="dxa" w:w="2268"/>
+            <w:shd w:val="clear" w:color="auto" w:fill="0F274D"/>
+            <w:tcBorders>
+              <w:top w:val="single" w:sz="4" w:space="0" w:color="FFFFFF"/>
+              <w:left w:val="single" w:sz="4" w:space="0" w:color="FFFFFF"/>
+              <w:bottom w:val="single" w:sz="4" w:space="0" w:color="FFFFFF"/>
+              <w:right w:val="single" w:sz="4" w:space="0" w:color="FFFFFF"/>
+            </w:tcBorders>
+          </w:tcPr>
+          <w:p>
+            <w:pPr>
+              <w:jc w:val="center"/>
+            </w:pPr>
+            <w:r>
+              <w:rPr>
+                <w:rFonts w:ascii="Calibri" w:hAnsi="Calibri"/>
+                <w:b/>
+                <w:i w:val="0"/>
+                <w:color w:val="FFFFFF"/>
+                <w:sz w:val="18"/>
+              </w:rPr>
+              <w:t>Side camera knee angle</w:t>
+            </w:r>
+          </w:p>
+        </w:tc>
+        <w:tc>
+          <w:tcPr>
+            <w:tcW w:type="dxa" w:w="2268"/>
+            <w:shd w:val="clear" w:color="auto" w:fill="0F274D"/>
+            <w:tcBorders>
+              <w:top w:val="single" w:sz="4" w:space="0" w:color="FFFFFF"/>
+              <w:left w:val="single" w:sz="4" w:space="0" w:color="FFFFFF"/>
+              <w:bottom w:val="single" w:sz="4" w:space="0" w:color="FFFFFF"/>
+              <w:right w:val="single" w:sz="4" w:space="0" w:color="FFFFFF"/>
+            </w:tcBorders>
+          </w:tcPr>
+          <w:p>
+            <w:pPr>
+              <w:jc w:val="center"/>
+            </w:pPr>
+            <w:r>
+              <w:rPr>
+                <w:rFonts w:ascii="Calibri" w:hAnsi="Calibri"/>
+                <w:b/>
+                <w:i w:val="0"/>
+                <w:color w:val="FFFFFF"/>
+                <w:sz w:val="18"/>
+              </w:rPr>
+              <w:t>Front camera knee angle</w:t>
+            </w:r>
+          </w:p>
+        </w:tc>
+        <w:tc>
+          <w:tcPr>
+            <w:tcW w:type="dxa" w:w="3402"/>
+            <w:shd w:val="clear" w:color="auto" w:fill="0F274D"/>
+            <w:tcBorders>
+              <w:top w:val="single" w:sz="4" w:space="0" w:color="FFFFFF"/>
+              <w:left w:val="single" w:sz="4" w:space="0" w:color="FFFFFF"/>
+              <w:bottom w:val="single" w:sz="4" w:space="0" w:color="FFFFFF"/>
+              <w:right w:val="single" w:sz="4" w:space="0" w:color="FFFFFF"/>
+            </w:tcBorders>
+          </w:tcPr>
+          <w:p>
+            <w:pPr>
+              <w:jc w:val="center"/>
+            </w:pPr>
+            <w:r>
+              <w:rPr>
+                <w:rFonts w:ascii="Calibri" w:hAnsi="Calibri"/>
+                <w:b/>
+                <w:i w:val="0"/>
+                <w:color w:val="FFFFFF"/>
+                <w:sz w:val="18"/>
+              </w:rPr>
+              <w:t>Used by</w:t>
+            </w:r>
+          </w:p>
+        </w:tc>
+      </w:tr>
+      <w:tr>
+        <w:tc>
+          <w:tcPr>
+            <w:tcW w:type="dxa" w:w="1587"/>
+            <w:shd w:val="clear" w:color="auto" w:fill="E0F4E8"/>
+            <w:tcBorders>
+              <w:top w:val="single" w:sz="4" w:space="0" w:color="CCCCCC"/>
+              <w:left w:val="single" w:sz="4" w:space="0" w:color="CCCCCC"/>
+              <w:bottom w:val="single" w:sz="4" w:space="0" w:color="CCCCCC"/>
+              <w:right w:val="single" w:sz="4" w:space="0" w:color="CCCCCC"/>
+            </w:tcBorders>
+          </w:tcPr>
+          <w:p>
+            <w:pPr>
+              <w:jc w:val="left"/>
+            </w:pPr>
+            <w:r>
+              <w:rPr>
+                <w:rFonts w:ascii="Calibri" w:hAnsi="Calibri"/>
+                <w:b w:val="0"/>
+                <w:i w:val="0"/>
+                <w:color w:val="1A6E2E"/>
+                <w:sz w:val="18"/>
+              </w:rPr>
+              <w:t>Excellent</w:t>
+            </w:r>
+          </w:p>
+        </w:tc>
+        <w:tc>
+          <w:tcPr>
+            <w:tcW w:type="dxa" w:w="2268"/>
+            <w:tcBorders>
+              <w:top w:val="single" w:sz="4" w:space="0" w:color="CCCCCC"/>
+              <w:left w:val="single" w:sz="4" w:space="0" w:color="CCCCCC"/>
+              <w:bottom w:val="single" w:sz="4" w:space="0" w:color="CCCCCC"/>
+              <w:right w:val="single" w:sz="4" w:space="0" w:color="CCCCCC"/>
+            </w:tcBorders>
+          </w:tcPr>
+          <w:p>
+            <w:pPr>
+              <w:jc w:val="left"/>
+            </w:pPr>
+            <w:r>
+              <w:rPr>
+                <w:rFonts w:ascii="Calibri" w:hAnsi="Calibri"/>
+                <w:b w:val="0"/>
+                <w:i w:val="0"/>
+                <w:color w:val="1C1C1C"/>
+                <w:sz w:val="18"/>
+              </w:rPr>
+              <w:t>45–70°</w:t>
+            </w:r>
+          </w:p>
+        </w:tc>
+        <w:tc>
+          <w:tcPr>
+            <w:tcW w:type="dxa" w:w="2268"/>
+            <w:tcBorders>
+              <w:top w:val="single" w:sz="4" w:space="0" w:color="CCCCCC"/>
+              <w:left w:val="single" w:sz="4" w:space="0" w:color="CCCCCC"/>
+              <w:bottom w:val="single" w:sz="4" w:space="0" w:color="CCCCCC"/>
+              <w:right w:val="single" w:sz="4" w:space="0" w:color="CCCCCC"/>
+            </w:tcBorders>
+          </w:tcPr>
+          <w:p>
+            <w:pPr>
+              <w:jc w:val="left"/>
+            </w:pPr>
+            <w:r>
+              <w:rPr>
+                <w:rFonts w:ascii="Calibri" w:hAnsi="Calibri"/>
+                <w:b w:val="0"/>
+                <w:i w:val="0"/>
+                <w:color w:val="1C1C1C"/>
+                <w:sz w:val="18"/>
+              </w:rPr>
+              <w:t>65–90°</w:t>
+            </w:r>
+          </w:p>
+        </w:tc>
+        <w:tc>
+          <w:tcPr>
+            <w:tcW w:type="dxa" w:w="3402"/>
+            <w:tcBorders>
+              <w:top w:val="single" w:sz="4" w:space="0" w:color="CCCCCC"/>
+              <w:left w:val="single" w:sz="4" w:space="0" w:color="CCCCCC"/>
+              <w:bottom w:val="single" w:sz="4" w:space="0" w:color="CCCCCC"/>
+              <w:right w:val="single" w:sz="4" w:space="0" w:color="CCCCCC"/>
+            </w:tcBorders>
+          </w:tcPr>
+          <w:p>
+            <w:pPr>
+              <w:jc w:val="left"/>
+            </w:pPr>
+            <w:r>
+              <w:rPr>
+                <w:rFonts w:ascii="Calibri" w:hAnsi="Calibri"/>
+                <w:b w:val="0"/>
+                <w:i w:val="0"/>
+                <w:color w:val="1C1C1C"/>
+                <w:sz w:val="18"/>
+              </w:rPr>
+              <w:t>LLM for scoring + coaching language</w:t>
+            </w:r>
+          </w:p>
+        </w:tc>
+      </w:tr>
+      <w:tr>
+        <w:tc>
+          <w:tcPr>
+            <w:tcW w:type="dxa" w:w="1587"/>
+            <w:shd w:val="clear" w:color="auto" w:fill="E0F4E8"/>
+            <w:tcBorders>
+              <w:top w:val="single" w:sz="4" w:space="0" w:color="CCCCCC"/>
+              <w:left w:val="single" w:sz="4" w:space="0" w:color="CCCCCC"/>
+              <w:bottom w:val="single" w:sz="4" w:space="0" w:color="CCCCCC"/>
+              <w:right w:val="single" w:sz="4" w:space="0" w:color="CCCCCC"/>
+            </w:tcBorders>
+          </w:tcPr>
+          <w:p>
+            <w:pPr>
+              <w:jc w:val="left"/>
+            </w:pPr>
+            <w:r>
+              <w:rPr>
+                <w:rFonts w:ascii="Calibri" w:hAnsi="Calibri"/>
+                <w:b w:val="0"/>
+                <w:i w:val="0"/>
+                <w:color w:val="1A6E2E"/>
+                <w:sz w:val="18"/>
+              </w:rPr>
+              <w:t>Good</w:t>
+            </w:r>
+          </w:p>
+        </w:tc>
+        <w:tc>
+          <w:tcPr>
+            <w:tcW w:type="dxa" w:w="2268"/>
+            <w:tcBorders>
+              <w:top w:val="single" w:sz="4" w:space="0" w:color="CCCCCC"/>
+              <w:left w:val="single" w:sz="4" w:space="0" w:color="CCCCCC"/>
+              <w:bottom w:val="single" w:sz="4" w:space="0" w:color="CCCCCC"/>
+              <w:right w:val="single" w:sz="4" w:space="0" w:color="CCCCCC"/>
+            </w:tcBorders>
+          </w:tcPr>
+          <w:p>
+            <w:pPr>
+              <w:jc w:val="left"/>
+            </w:pPr>
+            <w:r>
+              <w:rPr>
+                <w:rFonts w:ascii="Calibri" w:hAnsi="Calibri"/>
+                <w:b w:val="0"/>
+                <w:i w:val="0"/>
+                <w:color w:val="1C1C1C"/>
+                <w:sz w:val="18"/>
+              </w:rPr>
+              <w:t>70–90°</w:t>
+            </w:r>
+          </w:p>
+        </w:tc>
+        <w:tc>
+          <w:tcPr>
+            <w:tcW w:type="dxa" w:w="2268"/>
+            <w:tcBorders>
+              <w:top w:val="single" w:sz="4" w:space="0" w:color="CCCCCC"/>
+              <w:left w:val="single" w:sz="4" w:space="0" w:color="CCCCCC"/>
+              <w:bottom w:val="single" w:sz="4" w:space="0" w:color="CCCCCC"/>
+              <w:right w:val="single" w:sz="4" w:space="0" w:color="CCCCCC"/>
+            </w:tcBorders>
+          </w:tcPr>
+          <w:p>
+            <w:pPr>
+              <w:jc w:val="left"/>
+            </w:pPr>
+            <w:r>
+              <w:rPr>
+                <w:rFonts w:ascii="Calibri" w:hAnsi="Calibri"/>
+                <w:b w:val="0"/>
+                <w:i w:val="0"/>
+                <w:color w:val="1C1C1C"/>
+                <w:sz w:val="18"/>
+              </w:rPr>
+              <w:t>91–105°</w:t>
+            </w:r>
+          </w:p>
+        </w:tc>
+        <w:tc>
+          <w:tcPr>
+            <w:tcW w:type="dxa" w:w="3402"/>
+            <w:tcBorders>
+              <w:top w:val="single" w:sz="4" w:space="0" w:color="CCCCCC"/>
+              <w:left w:val="single" w:sz="4" w:space="0" w:color="CCCCCC"/>
+              <w:bottom w:val="single" w:sz="4" w:space="0" w:color="CCCCCC"/>
+              <w:right w:val="single" w:sz="4" w:space="0" w:color="CCCCCC"/>
+            </w:tcBorders>
+          </w:tcPr>
+          <w:p>
+            <w:pPr>
+              <w:jc w:val="left"/>
+            </w:pPr>
+            <w:r>
+              <w:rPr>
+                <w:rFonts w:ascii="Calibri" w:hAnsi="Calibri"/>
+                <w:b w:val="0"/>
+                <w:i w:val="0"/>
+                <w:color w:val="1C1C1C"/>
+                <w:sz w:val="18"/>
+              </w:rPr>
+              <w:t>LLM for scoring + coaching language</w:t>
+            </w:r>
+          </w:p>
+        </w:tc>
+      </w:tr>
+      <w:tr>
+        <w:tc>
+          <w:tcPr>
+            <w:tcW w:type="dxa" w:w="1587"/>
+            <w:shd w:val="clear" w:color="auto" w:fill="FFF3CD"/>
+            <w:tcBorders>
+              <w:top w:val="single" w:sz="4" w:space="0" w:color="CCCCCC"/>
+              <w:left w:val="single" w:sz="4" w:space="0" w:color="CCCCCC"/>
+              <w:bottom w:val="single" w:sz="4" w:space="0" w:color="CCCCCC"/>
+              <w:right w:val="single" w:sz="4" w:space="0" w:color="CCCCCC"/>
+            </w:tcBorders>
+          </w:tcPr>
+          <w:p>
+            <w:pPr>
+              <w:jc w:val="left"/>
+            </w:pPr>
+            <w:r>
+              <w:rPr>
+                <w:rFonts w:ascii="Calibri" w:hAnsi="Calibri"/>
+                <w:b w:val="0"/>
+                <w:i w:val="0"/>
+                <w:color w:val="C07000"/>
+                <w:sz w:val="18"/>
+              </w:rPr>
+              <w:t>Mild</w:t>
+            </w:r>
+          </w:p>
+        </w:tc>
+        <w:tc>
+          <w:tcPr>
+            <w:tcW w:type="dxa" w:w="2268"/>
+            <w:tcBorders>
+              <w:top w:val="single" w:sz="4" w:space="0" w:color="CCCCCC"/>
+              <w:left w:val="single" w:sz="4" w:space="0" w:color="CCCCCC"/>
+              <w:bottom w:val="single" w:sz="4" w:space="0" w:color="CCCCCC"/>
+              <w:right w:val="single" w:sz="4" w:space="0" w:color="CCCCCC"/>
+            </w:tcBorders>
+          </w:tcPr>
+          <w:p>
+            <w:pPr>
+              <w:jc w:val="left"/>
+            </w:pPr>
+            <w:r>
+              <w:rPr>
+                <w:rFonts w:ascii="Calibri" w:hAnsi="Calibri"/>
+                <w:b w:val="0"/>
+                <w:i w:val="0"/>
+                <w:color w:val="1C1C1C"/>
+                <w:sz w:val="18"/>
+              </w:rPr>
+              <w:t>90–110°</w:t>
+            </w:r>
+          </w:p>
+        </w:tc>
+        <w:tc>
+          <w:tcPr>
+            <w:tcW w:type="dxa" w:w="2268"/>
+            <w:tcBorders>
+              <w:top w:val="single" w:sz="4" w:space="0" w:color="CCCCCC"/>
+              <w:left w:val="single" w:sz="4" w:space="0" w:color="CCCCCC"/>
+              <w:bottom w:val="single" w:sz="4" w:space="0" w:color="CCCCCC"/>
+              <w:right w:val="single" w:sz="4" w:space="0" w:color="CCCCCC"/>
+            </w:tcBorders>
+          </w:tcPr>
+          <w:p>
+            <w:pPr>
+              <w:jc w:val="left"/>
+            </w:pPr>
+            <w:r>
+              <w:rPr>
+                <w:rFonts w:ascii="Calibri" w:hAnsi="Calibri"/>
+                <w:b w:val="0"/>
+                <w:i w:val="0"/>
+                <w:color w:val="1C1C1C"/>
+                <w:sz w:val="18"/>
+              </w:rPr>
+              <w:t>106–115°</w:t>
+            </w:r>
+          </w:p>
+        </w:tc>
+        <w:tc>
+          <w:tcPr>
+            <w:tcW w:type="dxa" w:w="3402"/>
+            <w:tcBorders>
+              <w:top w:val="single" w:sz="4" w:space="0" w:color="CCCCCC"/>
+              <w:left w:val="single" w:sz="4" w:space="0" w:color="CCCCCC"/>
+              <w:bottom w:val="single" w:sz="4" w:space="0" w:color="CCCCCC"/>
+              <w:right w:val="single" w:sz="4" w:space="0" w:color="CCCCCC"/>
+            </w:tcBorders>
+          </w:tcPr>
+          <w:p>
+            <w:pPr>
+              <w:jc w:val="left"/>
+            </w:pPr>
+            <w:r>
+              <w:rPr>
+                <w:rFonts w:ascii="Calibri" w:hAnsi="Calibri"/>
+                <w:b w:val="0"/>
+                <w:i w:val="0"/>
+                <w:color w:val="1C1C1C"/>
+                <w:sz w:val="18"/>
+              </w:rPr>
+              <w:t>LLM for scoring + coaching language</w:t>
+            </w:r>
+          </w:p>
+        </w:tc>
+      </w:tr>
+      <w:tr>
+        <w:tc>
+          <w:tcPr>
+            <w:tcW w:type="dxa" w:w="1587"/>
+            <w:shd w:val="clear" w:color="auto" w:fill="F8D0D0"/>
+            <w:tcBorders>
+              <w:top w:val="single" w:sz="4" w:space="0" w:color="CCCCCC"/>
+              <w:left w:val="single" w:sz="4" w:space="0" w:color="CCCCCC"/>
+              <w:bottom w:val="single" w:sz="4" w:space="0" w:color="CCCCCC"/>
+              <w:right w:val="single" w:sz="4" w:space="0" w:color="CCCCCC"/>
+            </w:tcBorders>
+          </w:tcPr>
+          <w:p>
+            <w:pPr>
+              <w:jc w:val="left"/>
+            </w:pPr>
+            <w:r>
+              <w:rPr>
+                <w:rFonts w:ascii="Calibri" w:hAnsi="Calibri"/>
+                <w:b w:val="0"/>
+                <w:i w:val="0"/>
+                <w:color w:val="C02020"/>
+                <w:sz w:val="18"/>
+              </w:rPr>
+              <w:t>Moderate</w:t>
+            </w:r>
+          </w:p>
+        </w:tc>
+        <w:tc>
+          <w:tcPr>
+            <w:tcW w:type="dxa" w:w="2268"/>
+            <w:tcBorders>
+              <w:top w:val="single" w:sz="4" w:space="0" w:color="CCCCCC"/>
+              <w:left w:val="single" w:sz="4" w:space="0" w:color="CCCCCC"/>
+              <w:bottom w:val="single" w:sz="4" w:space="0" w:color="CCCCCC"/>
+              <w:right w:val="single" w:sz="4" w:space="0" w:color="CCCCCC"/>
+            </w:tcBorders>
+          </w:tcPr>
+          <w:p>
+            <w:pPr>
+              <w:jc w:val="left"/>
+            </w:pPr>
+            <w:r>
+              <w:rPr>
+                <w:rFonts w:ascii="Calibri" w:hAnsi="Calibri"/>
+                <w:b w:val="0"/>
+                <w:i w:val="0"/>
+                <w:color w:val="1C1C1C"/>
+                <w:sz w:val="18"/>
+              </w:rPr>
+              <w:t>110–140°</w:t>
+            </w:r>
+          </w:p>
+        </w:tc>
+        <w:tc>
+          <w:tcPr>
+            <w:tcW w:type="dxa" w:w="2268"/>
+            <w:tcBorders>
+              <w:top w:val="single" w:sz="4" w:space="0" w:color="CCCCCC"/>
+              <w:left w:val="single" w:sz="4" w:space="0" w:color="CCCCCC"/>
+              <w:bottom w:val="single" w:sz="4" w:space="0" w:color="CCCCCC"/>
+              <w:right w:val="single" w:sz="4" w:space="0" w:color="CCCCCC"/>
+            </w:tcBorders>
+          </w:tcPr>
+          <w:p>
+            <w:pPr>
+              <w:jc w:val="left"/>
+            </w:pPr>
+            <w:r>
+              <w:rPr>
+                <w:rFonts w:ascii="Calibri" w:hAnsi="Calibri"/>
+                <w:b w:val="0"/>
+                <w:i w:val="0"/>
+                <w:color w:val="1C1C1C"/>
+                <w:sz w:val="18"/>
+              </w:rPr>
+              <w:t>116–125°</w:t>
+            </w:r>
+          </w:p>
+        </w:tc>
+        <w:tc>
+          <w:tcPr>
+            <w:tcW w:type="dxa" w:w="3402"/>
+            <w:tcBorders>
+              <w:top w:val="single" w:sz="4" w:space="0" w:color="CCCCCC"/>
+              <w:left w:val="single" w:sz="4" w:space="0" w:color="CCCCCC"/>
+              <w:bottom w:val="single" w:sz="4" w:space="0" w:color="CCCCCC"/>
+              <w:right w:val="single" w:sz="4" w:space="0" w:color="CCCCCC"/>
+            </w:tcBorders>
+          </w:tcPr>
+          <w:p>
+            <w:pPr>
+              <w:jc w:val="left"/>
+            </w:pPr>
+            <w:r>
+              <w:rPr>
+                <w:rFonts w:ascii="Calibri" w:hAnsi="Calibri"/>
+                <w:b w:val="0"/>
+                <w:i w:val="0"/>
+                <w:color w:val="1C1C1C"/>
+                <w:sz w:val="18"/>
+              </w:rPr>
+              <w:t>LLM for scoring + coaching language</w:t>
+            </w:r>
+          </w:p>
+        </w:tc>
+      </w:tr>
+      <w:tr>
+        <w:tc>
+          <w:tcPr>
+            <w:tcW w:type="dxa" w:w="1587"/>
+            <w:shd w:val="clear" w:color="auto" w:fill="F8D0D0"/>
+            <w:tcBorders>
+              <w:top w:val="single" w:sz="4" w:space="0" w:color="CCCCCC"/>
+              <w:left w:val="single" w:sz="4" w:space="0" w:color="CCCCCC"/>
+              <w:bottom w:val="single" w:sz="4" w:space="0" w:color="CCCCCC"/>
+              <w:right w:val="single" w:sz="4" w:space="0" w:color="CCCCCC"/>
+            </w:tcBorders>
+          </w:tcPr>
+          <w:p>
+            <w:pPr>
+              <w:jc w:val="left"/>
+            </w:pPr>
+            <w:r>
+              <w:rPr>
+                <w:rFonts w:ascii="Calibri" w:hAnsi="Calibri"/>
+                <w:b w:val="0"/>
+                <w:i w:val="0"/>
+                <w:color w:val="C02020"/>
+                <w:sz w:val="18"/>
+              </w:rPr>
+              <w:t>Severe</w:t>
+            </w:r>
+          </w:p>
+        </w:tc>
+        <w:tc>
+          <w:tcPr>
+            <w:tcW w:type="dxa" w:w="2268"/>
+            <w:tcBorders>
+              <w:top w:val="single" w:sz="4" w:space="0" w:color="CCCCCC"/>
+              <w:left w:val="single" w:sz="4" w:space="0" w:color="CCCCCC"/>
+              <w:bottom w:val="single" w:sz="4" w:space="0" w:color="CCCCCC"/>
+              <w:right w:val="single" w:sz="4" w:space="0" w:color="CCCCCC"/>
+            </w:tcBorders>
+          </w:tcPr>
+          <w:p>
+            <w:pPr>
+              <w:jc w:val="left"/>
+            </w:pPr>
+            <w:r>
+              <w:rPr>
+                <w:rFonts w:ascii="Calibri" w:hAnsi="Calibri"/>
+                <w:b w:val="0"/>
+                <w:i w:val="0"/>
+                <w:color w:val="1C1C1C"/>
+                <w:sz w:val="18"/>
+              </w:rPr>
+              <w:t>140°+</w:t>
+            </w:r>
+          </w:p>
+        </w:tc>
+        <w:tc>
+          <w:tcPr>
+            <w:tcW w:type="dxa" w:w="2268"/>
+            <w:tcBorders>
+              <w:top w:val="single" w:sz="4" w:space="0" w:color="CCCCCC"/>
+              <w:left w:val="single" w:sz="4" w:space="0" w:color="CCCCCC"/>
+              <w:bottom w:val="single" w:sz="4" w:space="0" w:color="CCCCCC"/>
+              <w:right w:val="single" w:sz="4" w:space="0" w:color="CCCCCC"/>
+            </w:tcBorders>
+          </w:tcPr>
+          <w:p>
+            <w:pPr>
+              <w:jc w:val="left"/>
+            </w:pPr>
+            <w:r>
+              <w:rPr>
+                <w:rFonts w:ascii="Calibri" w:hAnsi="Calibri"/>
+                <w:b w:val="0"/>
+                <w:i w:val="0"/>
+                <w:color w:val="1C1C1C"/>
+                <w:sz w:val="18"/>
+              </w:rPr>
+              <w:t>126°+</w:t>
+            </w:r>
+          </w:p>
+        </w:tc>
+        <w:tc>
+          <w:tcPr>
+            <w:tcW w:type="dxa" w:w="3402"/>
+            <w:tcBorders>
+              <w:top w:val="single" w:sz="4" w:space="0" w:color="CCCCCC"/>
+              <w:left w:val="single" w:sz="4" w:space="0" w:color="CCCCCC"/>
+              <w:bottom w:val="single" w:sz="4" w:space="0" w:color="CCCCCC"/>
+              <w:right w:val="single" w:sz="4" w:space="0" w:color="CCCCCC"/>
+            </w:tcBorders>
+          </w:tcPr>
+          <w:p>
+            <w:pPr>
+              <w:jc w:val="left"/>
+            </w:pPr>
+            <w:r>
+              <w:rPr>
+                <w:rFonts w:ascii="Calibri" w:hAnsi="Calibri"/>
+                <w:b w:val="0"/>
+                <w:i w:val="0"/>
+                <w:color w:val="1C1C1C"/>
+                <w:sz w:val="18"/>
+              </w:rPr>
+              <w:t>LLM for scoring + coaching language</w:t>
+            </w:r>
+          </w:p>
+        </w:tc>
+      </w:tr>
+    </w:tbl>
+    <w:p>
+      <w:pPr>
+        <w:spacing w:after="80"/>
+      </w:pPr>
+    </w:p>
+    <w:p>
+      <w:pPr>
+        <w:spacing w:before="20" w:after="80"/>
+      </w:pPr>
+      <w:r>
+        <w:rPr>
+          <w:rFonts w:ascii="Calibri" w:hAnsi="Calibri"/>
+          <w:b w:val="0"/>
+          <w:i w:val="0"/>
+          <w:color w:val="1C1C1C"/>
+          <w:sz w:val="20"/>
+        </w:rPr>
+        <w:t>The LLM receives the raw knee angle from the JSON + the depth_classification label (Excellent/Good/Warning) + the full MD 5-grade table via the coaching reference. It uses the 5-grade table for scoring — the 3-label system is for the user-facing image only.</w:t>
+      </w:r>
+    </w:p>
+    <w:p>
+      <w:pPr>
+        <w:spacing w:before="120" w:after="120"/>
+        <w:pBdr>
+          <w:bottom w:val="single" w:sz="6" w:space="1" w:color="1E5BA8"/>
+        </w:pBdr>
+      </w:pPr>
+    </w:p>
+    <w:p>
+      <w:pPr>
+        <w:spacing w:before="200" w:after="60"/>
+      </w:pPr>
+      <w:r>
+        <w:rPr>
+          <w:rFonts w:ascii="Calibri" w:hAnsi="Calibri"/>
+          <w:b/>
+          <w:i w:val="0"/>
+          <w:color w:val="1E5BA8"/>
+          <w:sz w:val="24"/>
+        </w:rPr>
+        <w:t>Updated action items — script output</w:t>
+      </w:r>
+    </w:p>
+    <w:tbl>
+      <w:tblPr>
+        <w:tblStyle w:val="TableGrid"/>
+        <w:tblW w:type="auto" w:w="0"/>
+        <w:tblLook w:firstColumn="1" w:firstRow="1" w:lastColumn="0" w:lastRow="0" w:noHBand="0" w:noVBand="1" w:val="04A0"/>
+      </w:tblPr>
+      <w:tblGrid>
+        <w:gridCol w:w="9746"/>
+      </w:tblGrid>
+      <w:tr>
+        <w:tc>
+          <w:tcPr>
+            <w:tcW w:type="dxa" w:w="9746"/>
+            <w:shd w:val="clear" w:color="auto" w:fill="FFF3CD"/>
+            <w:tcBorders>
+              <w:top w:val="single" w:sz="6" w:space="0" w:color="AAAAAA"/>
+              <w:left w:val="single" w:sz="6" w:space="0" w:color="AAAAAA"/>
+              <w:bottom w:val="single" w:sz="6" w:space="0" w:color="AAAAAA"/>
+              <w:right w:val="single" w:sz="6" w:space="0" w:color="AAAAAA"/>
+            </w:tcBorders>
+          </w:tcPr>
+          <w:p>
+            <w:pPr>
+              <w:spacing w:before="40" w:after="40"/>
+            </w:pPr>
+            <w:r>
+              <w:rPr>
+                <w:rFonts w:ascii="Calibri" w:hAnsi="Calibri"/>
+                <w:b/>
+                <w:i w:val="0"/>
+                <w:color w:val="C07000"/>
+                <w:sz w:val="20"/>
+              </w:rPr>
+              <w:t xml:space="preserve">Action update:  </w:t>
+            </w:r>
+            <w:r>
+              <w:rPr>
+                <w:rFonts w:ascii="Calibri" w:hAnsi="Calibri"/>
+                <w:b w:val="0"/>
+                <w:i w:val="0"/>
+                <w:color w:val="1C1C1C"/>
+                <w:sz w:val="20"/>
+              </w:rPr>
+              <w:t>Biomechanics script depth_classification field must output exactly three values: 'Excellent', 'Good', or 'Warning' — not the old 'deep' / 'parallel' / 'insufficient' labels. depth_insufficient_flag remains as boolean (True when Warning).</w:t>
+            </w:r>
+          </w:p>
+        </w:tc>
+      </w:tr>
+    </w:tbl>
+    <w:p>
+      <w:pPr>
+        <w:spacing w:after="80"/>
+      </w:pPr>
+    </w:p>
+    <w:p>
+      <w:pPr>
+        <w:spacing w:before="320"/>
+      </w:pPr>
+      <w:r>
+        <w:rPr>
+          <w:rFonts w:ascii="Calibri" w:hAnsi="Calibri"/>
+          <w:b w:val="0"/>
+          <w:i/>
+          <w:color w:val="555555"/>
+          <w:sz w:val="16"/>
+        </w:rPr>
+        <w:t>Kinetic  ·  Threshold Alignment Brief  ·  Depth — Label Architecture  ·  May 2026</w:t>
       </w:r>
     </w:p>
     <w:sectPr>

</xml_diff>

<commit_message>
Threshold Alignment: add depth classification logic to document
Step 1 (boolean): hip_y >= knee_y → Warning (camera-agnostic positional
check, most accurate, no angle conversion needed).

Step 2 (knee angle, only if Step 1 passes):
  Side camera: ≤70° → Excellent, 71-90° → Good
  Front camera: ≤90° → Excellent, 91-105° → Good

Pseudocode added. Final sign-off table added with all 5 rows.
MD 5-grade system confirmed unchanged — LLM use only.

Co-Authored-By: Claude Sonnet 4.6 <noreply@anthropic.com>
</commit_message>
<xml_diff>
--- a/Kinetic_Threshold_Alignment.docx
+++ b/Kinetic_Threshold_Alignment.docx
@@ -12883,6 +12883,1464 @@
           <w:sz w:val="16"/>
         </w:rPr>
         <w:t>Kinetic  ·  Threshold Alignment Brief  ·  Depth — Label Architecture  ·  May 2026</w:t>
+      </w:r>
+    </w:p>
+    <w:p>
+      <w:pPr>
+        <w:spacing w:before="120" w:after="120"/>
+        <w:pBdr>
+          <w:bottom w:val="single" w:sz="6" w:space="1" w:color="1E5BA8"/>
+        </w:pBdr>
+      </w:pPr>
+    </w:p>
+    <w:p>
+      <w:pPr>
+        <w:spacing w:before="200" w:after="60"/>
+      </w:pPr>
+      <w:r>
+        <w:rPr>
+          <w:rFonts w:ascii="Calibri" w:hAnsi="Calibri"/>
+          <w:b/>
+          <w:i w:val="0"/>
+          <w:color w:val="1E5BA8"/>
+          <w:sz w:val="24"/>
+        </w:rPr>
+        <w:t>Classification logic — agreed</w:t>
+      </w:r>
+    </w:p>
+    <w:p>
+      <w:pPr>
+        <w:spacing w:before="20" w:after="80"/>
+      </w:pPr>
+      <w:r>
+        <w:rPr>
+          <w:rFonts w:ascii="Calibri" w:hAnsi="Calibri"/>
+          <w:b w:val="0"/>
+          <w:i w:val="0"/>
+          <w:color w:val="1C1C1C"/>
+          <w:sz w:val="20"/>
+        </w:rPr>
+        <w:t>Depth classification uses two signals in sequence. Both are camera-agnostic for Step 1.</w:t>
+      </w:r>
+    </w:p>
+    <w:tbl>
+      <w:tblPr>
+        <w:tblStyle w:val="TableGrid"/>
+        <w:tblW w:type="auto" w:w="0"/>
+        <w:tblLook w:firstColumn="1" w:firstRow="1" w:lastColumn="0" w:lastRow="0" w:noHBand="0" w:noVBand="1" w:val="04A0"/>
+      </w:tblPr>
+      <w:tblGrid>
+        <w:gridCol w:w="2436"/>
+        <w:gridCol w:w="2436"/>
+        <w:gridCol w:w="2436"/>
+        <w:gridCol w:w="2436"/>
+      </w:tblGrid>
+      <w:tr>
+        <w:tc>
+          <w:tcPr>
+            <w:tcW w:type="dxa" w:w="1134"/>
+            <w:shd w:val="clear" w:color="auto" w:fill="0F274D"/>
+            <w:tcBorders>
+              <w:top w:val="single" w:sz="4" w:space="0" w:color="FFFFFF"/>
+              <w:left w:val="single" w:sz="4" w:space="0" w:color="FFFFFF"/>
+              <w:bottom w:val="single" w:sz="4" w:space="0" w:color="FFFFFF"/>
+              <w:right w:val="single" w:sz="4" w:space="0" w:color="FFFFFF"/>
+            </w:tcBorders>
+          </w:tcPr>
+          <w:p>
+            <w:pPr>
+              <w:jc w:val="center"/>
+            </w:pPr>
+            <w:r>
+              <w:rPr>
+                <w:rFonts w:ascii="Calibri" w:hAnsi="Calibri"/>
+                <w:b/>
+                <w:i w:val="0"/>
+                <w:color w:val="FFFFFF"/>
+                <w:sz w:val="18"/>
+              </w:rPr>
+              <w:t>Step</w:t>
+            </w:r>
+          </w:p>
+        </w:tc>
+        <w:tc>
+          <w:tcPr>
+            <w:tcW w:type="dxa" w:w="2835"/>
+            <w:shd w:val="clear" w:color="auto" w:fill="0F274D"/>
+            <w:tcBorders>
+              <w:top w:val="single" w:sz="4" w:space="0" w:color="FFFFFF"/>
+              <w:left w:val="single" w:sz="4" w:space="0" w:color="FFFFFF"/>
+              <w:bottom w:val="single" w:sz="4" w:space="0" w:color="FFFFFF"/>
+              <w:right w:val="single" w:sz="4" w:space="0" w:color="FFFFFF"/>
+            </w:tcBorders>
+          </w:tcPr>
+          <w:p>
+            <w:pPr>
+              <w:jc w:val="center"/>
+            </w:pPr>
+            <w:r>
+              <w:rPr>
+                <w:rFonts w:ascii="Calibri" w:hAnsi="Calibri"/>
+                <w:b/>
+                <w:i w:val="0"/>
+                <w:color w:val="FFFFFF"/>
+                <w:sz w:val="18"/>
+              </w:rPr>
+              <w:t>Signal</w:t>
+            </w:r>
+          </w:p>
+        </w:tc>
+        <w:tc>
+          <w:tcPr>
+            <w:tcW w:type="dxa" w:w="3118"/>
+            <w:shd w:val="clear" w:color="auto" w:fill="0F274D"/>
+            <w:tcBorders>
+              <w:top w:val="single" w:sz="4" w:space="0" w:color="FFFFFF"/>
+              <w:left w:val="single" w:sz="4" w:space="0" w:color="FFFFFF"/>
+              <w:bottom w:val="single" w:sz="4" w:space="0" w:color="FFFFFF"/>
+              <w:right w:val="single" w:sz="4" w:space="0" w:color="FFFFFF"/>
+            </w:tcBorders>
+          </w:tcPr>
+          <w:p>
+            <w:pPr>
+              <w:jc w:val="center"/>
+            </w:pPr>
+            <w:r>
+              <w:rPr>
+                <w:rFonts w:ascii="Calibri" w:hAnsi="Calibri"/>
+                <w:b/>
+                <w:i w:val="0"/>
+                <w:color w:val="FFFFFF"/>
+                <w:sz w:val="18"/>
+              </w:rPr>
+              <w:t>Logic</w:t>
+            </w:r>
+          </w:p>
+        </w:tc>
+        <w:tc>
+          <w:tcPr>
+            <w:tcW w:type="dxa" w:w="2551"/>
+            <w:shd w:val="clear" w:color="auto" w:fill="0F274D"/>
+            <w:tcBorders>
+              <w:top w:val="single" w:sz="4" w:space="0" w:color="FFFFFF"/>
+              <w:left w:val="single" w:sz="4" w:space="0" w:color="FFFFFF"/>
+              <w:bottom w:val="single" w:sz="4" w:space="0" w:color="FFFFFF"/>
+              <w:right w:val="single" w:sz="4" w:space="0" w:color="FFFFFF"/>
+            </w:tcBorders>
+          </w:tcPr>
+          <w:p>
+            <w:pPr>
+              <w:jc w:val="center"/>
+            </w:pPr>
+            <w:r>
+              <w:rPr>
+                <w:rFonts w:ascii="Calibri" w:hAnsi="Calibri"/>
+                <w:b/>
+                <w:i w:val="0"/>
+                <w:color w:val="FFFFFF"/>
+                <w:sz w:val="18"/>
+              </w:rPr>
+              <w:t>Result</w:t>
+            </w:r>
+          </w:p>
+        </w:tc>
+      </w:tr>
+      <w:tr>
+        <w:tc>
+          <w:tcPr>
+            <w:tcW w:type="dxa" w:w="1134"/>
+            <w:tcBorders>
+              <w:top w:val="single" w:sz="4" w:space="0" w:color="CCCCCC"/>
+              <w:left w:val="single" w:sz="4" w:space="0" w:color="CCCCCC"/>
+              <w:bottom w:val="single" w:sz="4" w:space="0" w:color="CCCCCC"/>
+              <w:right w:val="single" w:sz="4" w:space="0" w:color="CCCCCC"/>
+            </w:tcBorders>
+          </w:tcPr>
+          <w:p>
+            <w:pPr>
+              <w:jc w:val="left"/>
+            </w:pPr>
+            <w:r>
+              <w:rPr>
+                <w:rFonts w:ascii="Calibri" w:hAnsi="Calibri"/>
+                <w:b w:val="0"/>
+                <w:i w:val="0"/>
+                <w:color w:val="1C1C1C"/>
+                <w:sz w:val="18"/>
+              </w:rPr>
+              <w:t>Step 1</w:t>
+            </w:r>
+          </w:p>
+        </w:tc>
+        <w:tc>
+          <w:tcPr>
+            <w:tcW w:type="dxa" w:w="2835"/>
+            <w:tcBorders>
+              <w:top w:val="single" w:sz="4" w:space="0" w:color="CCCCCC"/>
+              <w:left w:val="single" w:sz="4" w:space="0" w:color="CCCCCC"/>
+              <w:bottom w:val="single" w:sz="4" w:space="0" w:color="CCCCCC"/>
+              <w:right w:val="single" w:sz="4" w:space="0" w:color="CCCCCC"/>
+            </w:tcBorders>
+          </w:tcPr>
+          <w:p>
+            <w:pPr>
+              <w:jc w:val="left"/>
+            </w:pPr>
+            <w:r>
+              <w:rPr>
+                <w:rFonts w:ascii="Calibri" w:hAnsi="Calibri"/>
+                <w:b w:val="0"/>
+                <w:i w:val="0"/>
+                <w:color w:val="1C1C1C"/>
+                <w:sz w:val="18"/>
+              </w:rPr>
+              <w:t>Hip position vs knee</w:t>
+              <w:br/>
+              <w:t>(MediaPipe y-coordinates)</w:t>
+            </w:r>
+          </w:p>
+        </w:tc>
+        <w:tc>
+          <w:tcPr>
+            <w:tcW w:type="dxa" w:w="3118"/>
+            <w:shd w:val="clear" w:color="auto" w:fill="F8D0D0"/>
+            <w:tcBorders>
+              <w:top w:val="single" w:sz="4" w:space="0" w:color="CCCCCC"/>
+              <w:left w:val="single" w:sz="4" w:space="0" w:color="CCCCCC"/>
+              <w:bottom w:val="single" w:sz="4" w:space="0" w:color="CCCCCC"/>
+              <w:right w:val="single" w:sz="4" w:space="0" w:color="CCCCCC"/>
+            </w:tcBorders>
+          </w:tcPr>
+          <w:p>
+            <w:pPr>
+              <w:jc w:val="left"/>
+            </w:pPr>
+            <w:r>
+              <w:rPr>
+                <w:rFonts w:ascii="Calibri" w:hAnsi="Calibri"/>
+                <w:b w:val="0"/>
+                <w:i w:val="0"/>
+                <w:color w:val="C02020"/>
+                <w:sz w:val="18"/>
+              </w:rPr>
+              <w:t>hip_y ≥ knee_y</w:t>
+              <w:br/>
+              <w:t>(hip NOT below knee)</w:t>
+            </w:r>
+          </w:p>
+        </w:tc>
+        <w:tc>
+          <w:tcPr>
+            <w:tcW w:type="dxa" w:w="2551"/>
+            <w:shd w:val="clear" w:color="auto" w:fill="F8D0D0"/>
+            <w:tcBorders>
+              <w:top w:val="single" w:sz="4" w:space="0" w:color="CCCCCC"/>
+              <w:left w:val="single" w:sz="4" w:space="0" w:color="CCCCCC"/>
+              <w:bottom w:val="single" w:sz="4" w:space="0" w:color="CCCCCC"/>
+              <w:right w:val="single" w:sz="4" w:space="0" w:color="CCCCCC"/>
+            </w:tcBorders>
+          </w:tcPr>
+          <w:p>
+            <w:pPr>
+              <w:jc w:val="left"/>
+            </w:pPr>
+            <w:r>
+              <w:rPr>
+                <w:rFonts w:ascii="Calibri" w:hAnsi="Calibri"/>
+                <w:b w:val="0"/>
+                <w:i w:val="0"/>
+                <w:color w:val="C02020"/>
+                <w:sz w:val="18"/>
+              </w:rPr>
+              <w:t>→ Warning</w:t>
+              <w:br/>
+              <w:t>skip Step 2</w:t>
+            </w:r>
+          </w:p>
+        </w:tc>
+      </w:tr>
+      <w:tr>
+        <w:tc>
+          <w:tcPr>
+            <w:tcW w:type="dxa" w:w="1134"/>
+            <w:tcBorders>
+              <w:top w:val="single" w:sz="4" w:space="0" w:color="CCCCCC"/>
+              <w:left w:val="single" w:sz="4" w:space="0" w:color="CCCCCC"/>
+              <w:bottom w:val="single" w:sz="4" w:space="0" w:color="CCCCCC"/>
+              <w:right w:val="single" w:sz="4" w:space="0" w:color="CCCCCC"/>
+            </w:tcBorders>
+          </w:tcPr>
+          <w:p>
+            <w:pPr>
+              <w:jc w:val="left"/>
+            </w:pPr>
+            <w:r>
+              <w:rPr>
+                <w:rFonts w:ascii="Calibri" w:hAnsi="Calibri"/>
+                <w:b w:val="0"/>
+                <w:i w:val="0"/>
+                <w:color w:val="1C1C1C"/>
+                <w:sz w:val="18"/>
+              </w:rPr>
+              <w:t>Step 1 pass</w:t>
+            </w:r>
+          </w:p>
+        </w:tc>
+        <w:tc>
+          <w:tcPr>
+            <w:tcW w:type="dxa" w:w="2835"/>
+            <w:tcBorders>
+              <w:top w:val="single" w:sz="4" w:space="0" w:color="CCCCCC"/>
+              <w:left w:val="single" w:sz="4" w:space="0" w:color="CCCCCC"/>
+              <w:bottom w:val="single" w:sz="4" w:space="0" w:color="CCCCCC"/>
+              <w:right w:val="single" w:sz="4" w:space="0" w:color="CCCCCC"/>
+            </w:tcBorders>
+          </w:tcPr>
+          <w:p>
+            <w:pPr>
+              <w:jc w:val="left"/>
+            </w:pPr>
+            <w:r>
+              <w:rPr>
+                <w:rFonts w:ascii="Calibri" w:hAnsi="Calibri"/>
+                <w:b w:val="0"/>
+                <w:i w:val="0"/>
+                <w:color w:val="1C1C1C"/>
+                <w:sz w:val="18"/>
+              </w:rPr>
+              <w:t>Hip position vs knee</w:t>
+              <w:br/>
+              <w:t>(MediaPipe y-coordinates)</w:t>
+            </w:r>
+          </w:p>
+        </w:tc>
+        <w:tc>
+          <w:tcPr>
+            <w:tcW w:type="dxa" w:w="3118"/>
+            <w:shd w:val="clear" w:color="auto" w:fill="E0F4E8"/>
+            <w:tcBorders>
+              <w:top w:val="single" w:sz="4" w:space="0" w:color="CCCCCC"/>
+              <w:left w:val="single" w:sz="4" w:space="0" w:color="CCCCCC"/>
+              <w:bottom w:val="single" w:sz="4" w:space="0" w:color="CCCCCC"/>
+              <w:right w:val="single" w:sz="4" w:space="0" w:color="CCCCCC"/>
+            </w:tcBorders>
+          </w:tcPr>
+          <w:p>
+            <w:pPr>
+              <w:jc w:val="left"/>
+            </w:pPr>
+            <w:r>
+              <w:rPr>
+                <w:rFonts w:ascii="Calibri" w:hAnsi="Calibri"/>
+                <w:b w:val="0"/>
+                <w:i w:val="0"/>
+                <w:color w:val="1A6E2E"/>
+                <w:sz w:val="18"/>
+              </w:rPr>
+              <w:t>hip_y &lt; knee_y</w:t>
+              <w:br/>
+              <w:t>(hip below knee)</w:t>
+            </w:r>
+          </w:p>
+        </w:tc>
+        <w:tc>
+          <w:tcPr>
+            <w:tcW w:type="dxa" w:w="2551"/>
+            <w:shd w:val="clear" w:color="auto" w:fill="E0F4E8"/>
+            <w:tcBorders>
+              <w:top w:val="single" w:sz="4" w:space="0" w:color="CCCCCC"/>
+              <w:left w:val="single" w:sz="4" w:space="0" w:color="CCCCCC"/>
+              <w:bottom w:val="single" w:sz="4" w:space="0" w:color="CCCCCC"/>
+              <w:right w:val="single" w:sz="4" w:space="0" w:color="CCCCCC"/>
+            </w:tcBorders>
+          </w:tcPr>
+          <w:p>
+            <w:pPr>
+              <w:jc w:val="left"/>
+            </w:pPr>
+            <w:r>
+              <w:rPr>
+                <w:rFonts w:ascii="Calibri" w:hAnsi="Calibri"/>
+                <w:b w:val="0"/>
+                <w:i w:val="0"/>
+                <w:color w:val="1A6E2E"/>
+                <w:sz w:val="18"/>
+              </w:rPr>
+              <w:t>→ proceed to Step 2</w:t>
+            </w:r>
+          </w:p>
+        </w:tc>
+      </w:tr>
+      <w:tr>
+        <w:tc>
+          <w:tcPr>
+            <w:tcW w:type="dxa" w:w="1134"/>
+            <w:tcBorders>
+              <w:top w:val="single" w:sz="4" w:space="0" w:color="CCCCCC"/>
+              <w:left w:val="single" w:sz="4" w:space="0" w:color="CCCCCC"/>
+              <w:bottom w:val="single" w:sz="4" w:space="0" w:color="CCCCCC"/>
+              <w:right w:val="single" w:sz="4" w:space="0" w:color="CCCCCC"/>
+            </w:tcBorders>
+          </w:tcPr>
+          <w:p>
+            <w:pPr>
+              <w:jc w:val="left"/>
+            </w:pPr>
+            <w:r>
+              <w:rPr>
+                <w:rFonts w:ascii="Calibri" w:hAnsi="Calibri"/>
+                <w:b w:val="0"/>
+                <w:i w:val="0"/>
+                <w:color w:val="1C1C1C"/>
+                <w:sz w:val="18"/>
+              </w:rPr>
+              <w:t>Step 2</w:t>
+            </w:r>
+          </w:p>
+        </w:tc>
+        <w:tc>
+          <w:tcPr>
+            <w:tcW w:type="dxa" w:w="2835"/>
+            <w:tcBorders>
+              <w:top w:val="single" w:sz="4" w:space="0" w:color="CCCCCC"/>
+              <w:left w:val="single" w:sz="4" w:space="0" w:color="CCCCCC"/>
+              <w:bottom w:val="single" w:sz="4" w:space="0" w:color="CCCCCC"/>
+              <w:right w:val="single" w:sz="4" w:space="0" w:color="CCCCCC"/>
+            </w:tcBorders>
+          </w:tcPr>
+          <w:p>
+            <w:pPr>
+              <w:jc w:val="left"/>
+            </w:pPr>
+            <w:r>
+              <w:rPr>
+                <w:rFonts w:ascii="Calibri" w:hAnsi="Calibri"/>
+                <w:b w:val="0"/>
+                <w:i w:val="0"/>
+                <w:color w:val="1C1C1C"/>
+                <w:sz w:val="18"/>
+              </w:rPr>
+              <w:t>Knee angle at bottom</w:t>
+              <w:br/>
+              <w:t>(MediaPipe interior)</w:t>
+            </w:r>
+          </w:p>
+        </w:tc>
+        <w:tc>
+          <w:tcPr>
+            <w:tcW w:type="dxa" w:w="3118"/>
+            <w:shd w:val="clear" w:color="auto" w:fill="E0F4E8"/>
+            <w:tcBorders>
+              <w:top w:val="single" w:sz="4" w:space="0" w:color="CCCCCC"/>
+              <w:left w:val="single" w:sz="4" w:space="0" w:color="CCCCCC"/>
+              <w:bottom w:val="single" w:sz="4" w:space="0" w:color="CCCCCC"/>
+              <w:right w:val="single" w:sz="4" w:space="0" w:color="CCCCCC"/>
+            </w:tcBorders>
+          </w:tcPr>
+          <w:p>
+            <w:pPr>
+              <w:jc w:val="left"/>
+            </w:pPr>
+            <w:r>
+              <w:rPr>
+                <w:rFonts w:ascii="Calibri" w:hAnsi="Calibri"/>
+                <w:b w:val="0"/>
+                <w:i w:val="0"/>
+                <w:color w:val="1A6E2E"/>
+                <w:sz w:val="18"/>
+              </w:rPr>
+              <w:t>Side ≤70°  /  Front ≤90°</w:t>
+            </w:r>
+          </w:p>
+        </w:tc>
+        <w:tc>
+          <w:tcPr>
+            <w:tcW w:type="dxa" w:w="2551"/>
+            <w:shd w:val="clear" w:color="auto" w:fill="E0F4E8"/>
+            <w:tcBorders>
+              <w:top w:val="single" w:sz="4" w:space="0" w:color="CCCCCC"/>
+              <w:left w:val="single" w:sz="4" w:space="0" w:color="CCCCCC"/>
+              <w:bottom w:val="single" w:sz="4" w:space="0" w:color="CCCCCC"/>
+              <w:right w:val="single" w:sz="4" w:space="0" w:color="CCCCCC"/>
+            </w:tcBorders>
+          </w:tcPr>
+          <w:p>
+            <w:pPr>
+              <w:jc w:val="left"/>
+            </w:pPr>
+            <w:r>
+              <w:rPr>
+                <w:rFonts w:ascii="Calibri" w:hAnsi="Calibri"/>
+                <w:b w:val="0"/>
+                <w:i w:val="0"/>
+                <w:color w:val="1A6E2E"/>
+                <w:sz w:val="18"/>
+              </w:rPr>
+              <w:t>→ Excellent</w:t>
+            </w:r>
+          </w:p>
+        </w:tc>
+      </w:tr>
+      <w:tr>
+        <w:tc>
+          <w:tcPr>
+            <w:tcW w:type="dxa" w:w="1134"/>
+            <w:tcBorders>
+              <w:top w:val="single" w:sz="4" w:space="0" w:color="CCCCCC"/>
+              <w:left w:val="single" w:sz="4" w:space="0" w:color="CCCCCC"/>
+              <w:bottom w:val="single" w:sz="4" w:space="0" w:color="CCCCCC"/>
+              <w:right w:val="single" w:sz="4" w:space="0" w:color="CCCCCC"/>
+            </w:tcBorders>
+          </w:tcPr>
+          <w:p>
+            <w:pPr>
+              <w:jc w:val="left"/>
+            </w:pPr>
+            <w:r>
+              <w:rPr>
+                <w:rFonts w:ascii="Calibri" w:hAnsi="Calibri"/>
+                <w:b w:val="0"/>
+                <w:i w:val="0"/>
+                <w:color w:val="1C1C1C"/>
+                <w:sz w:val="18"/>
+              </w:rPr>
+              <w:t>Step 2</w:t>
+            </w:r>
+          </w:p>
+        </w:tc>
+        <w:tc>
+          <w:tcPr>
+            <w:tcW w:type="dxa" w:w="2835"/>
+            <w:tcBorders>
+              <w:top w:val="single" w:sz="4" w:space="0" w:color="CCCCCC"/>
+              <w:left w:val="single" w:sz="4" w:space="0" w:color="CCCCCC"/>
+              <w:bottom w:val="single" w:sz="4" w:space="0" w:color="CCCCCC"/>
+              <w:right w:val="single" w:sz="4" w:space="0" w:color="CCCCCC"/>
+            </w:tcBorders>
+          </w:tcPr>
+          <w:p>
+            <w:pPr>
+              <w:jc w:val="left"/>
+            </w:pPr>
+            <w:r>
+              <w:rPr>
+                <w:rFonts w:ascii="Calibri" w:hAnsi="Calibri"/>
+                <w:b w:val="0"/>
+                <w:i w:val="0"/>
+                <w:color w:val="1C1C1C"/>
+                <w:sz w:val="18"/>
+              </w:rPr>
+              <w:t>Knee angle at bottom</w:t>
+              <w:br/>
+              <w:t>(MediaPipe interior)</w:t>
+            </w:r>
+          </w:p>
+        </w:tc>
+        <w:tc>
+          <w:tcPr>
+            <w:tcW w:type="dxa" w:w="3118"/>
+            <w:shd w:val="clear" w:color="auto" w:fill="E0F4E8"/>
+            <w:tcBorders>
+              <w:top w:val="single" w:sz="4" w:space="0" w:color="CCCCCC"/>
+              <w:left w:val="single" w:sz="4" w:space="0" w:color="CCCCCC"/>
+              <w:bottom w:val="single" w:sz="4" w:space="0" w:color="CCCCCC"/>
+              <w:right w:val="single" w:sz="4" w:space="0" w:color="CCCCCC"/>
+            </w:tcBorders>
+          </w:tcPr>
+          <w:p>
+            <w:pPr>
+              <w:jc w:val="left"/>
+            </w:pPr>
+            <w:r>
+              <w:rPr>
+                <w:rFonts w:ascii="Calibri" w:hAnsi="Calibri"/>
+                <w:b w:val="0"/>
+                <w:i w:val="0"/>
+                <w:color w:val="1A6E2E"/>
+                <w:sz w:val="18"/>
+              </w:rPr>
+              <w:t>Side 71–90°  /  Front 91–105°</w:t>
+            </w:r>
+          </w:p>
+        </w:tc>
+        <w:tc>
+          <w:tcPr>
+            <w:tcW w:type="dxa" w:w="2551"/>
+            <w:shd w:val="clear" w:color="auto" w:fill="E0F4E8"/>
+            <w:tcBorders>
+              <w:top w:val="single" w:sz="4" w:space="0" w:color="CCCCCC"/>
+              <w:left w:val="single" w:sz="4" w:space="0" w:color="CCCCCC"/>
+              <w:bottom w:val="single" w:sz="4" w:space="0" w:color="CCCCCC"/>
+              <w:right w:val="single" w:sz="4" w:space="0" w:color="CCCCCC"/>
+            </w:tcBorders>
+          </w:tcPr>
+          <w:p>
+            <w:pPr>
+              <w:jc w:val="left"/>
+            </w:pPr>
+            <w:r>
+              <w:rPr>
+                <w:rFonts w:ascii="Calibri" w:hAnsi="Calibri"/>
+                <w:b w:val="0"/>
+                <w:i w:val="0"/>
+                <w:color w:val="1A6E2E"/>
+                <w:sz w:val="18"/>
+              </w:rPr>
+              <w:t>→ Good</w:t>
+            </w:r>
+          </w:p>
+        </w:tc>
+      </w:tr>
+    </w:tbl>
+    <w:p>
+      <w:pPr>
+        <w:spacing w:after="80"/>
+      </w:pPr>
+    </w:p>
+    <w:tbl>
+      <w:tblPr>
+        <w:tblStyle w:val="TableGrid"/>
+        <w:tblW w:type="auto" w:w="0"/>
+        <w:tblLook w:firstColumn="1" w:firstRow="1" w:lastColumn="0" w:lastRow="0" w:noHBand="0" w:noVBand="1" w:val="04A0"/>
+      </w:tblPr>
+      <w:tblGrid>
+        <w:gridCol w:w="9746"/>
+      </w:tblGrid>
+      <w:tr>
+        <w:tc>
+          <w:tcPr>
+            <w:tcW w:type="dxa" w:w="9746"/>
+            <w:shd w:val="clear" w:color="auto" w:fill="E8F0FE"/>
+            <w:tcBorders>
+              <w:top w:val="single" w:sz="6" w:space="0" w:color="AAAAAA"/>
+              <w:left w:val="single" w:sz="6" w:space="0" w:color="AAAAAA"/>
+              <w:bottom w:val="single" w:sz="6" w:space="0" w:color="AAAAAA"/>
+              <w:right w:val="single" w:sz="6" w:space="0" w:color="AAAAAA"/>
+            </w:tcBorders>
+          </w:tcPr>
+          <w:p>
+            <w:pPr>
+              <w:spacing w:before="40" w:after="40"/>
+            </w:pPr>
+            <w:r>
+              <w:rPr>
+                <w:rFonts w:ascii="Calibri" w:hAnsi="Calibri"/>
+                <w:b/>
+                <w:i w:val="0"/>
+                <w:color w:val="1E5BA8"/>
+                <w:sz w:val="20"/>
+              </w:rPr>
+              <w:t xml:space="preserve">Why two steps:  </w:t>
+            </w:r>
+            <w:r>
+              <w:rPr>
+                <w:rFonts w:ascii="Calibri" w:hAnsi="Calibri"/>
+                <w:b w:val="0"/>
+                <w:i w:val="0"/>
+                <w:color w:val="1C1C1C"/>
+                <w:sz w:val="20"/>
+              </w:rPr>
+              <w:t>Step 1 (hip_y &lt; knee_y) is the clinical definition of squat depth — it is a positional check, not angular, and works accurately from any camera angle. Step 2 (knee angle) only runs when depth is already achieved — it grades HOW deep, distinguishing full depth (Excellent) from just-at-parallel (Good).</w:t>
+            </w:r>
+          </w:p>
+        </w:tc>
+      </w:tr>
+    </w:tbl>
+    <w:p>
+      <w:pPr>
+        <w:spacing w:after="80"/>
+      </w:pPr>
+    </w:p>
+    <w:p>
+      <w:pPr>
+        <w:spacing w:before="20" w:after="80"/>
+      </w:pPr>
+      <w:r>
+        <w:rPr>
+          <w:rFonts w:ascii="Calibri" w:hAnsi="Calibri"/>
+          <w:b w:val="0"/>
+          <w:i w:val="0"/>
+          <w:color w:val="1C1C1C"/>
+          <w:sz w:val="20"/>
+        </w:rPr>
+        <w:t>Pseudocode for biomechanics script:</w:t>
+      </w:r>
+    </w:p>
+    <w:tbl>
+      <w:tblPr>
+        <w:tblStyle w:val="TableGrid"/>
+        <w:tblW w:type="auto" w:w="0"/>
+        <w:tblLook w:firstColumn="1" w:firstRow="1" w:lastColumn="0" w:lastRow="0" w:noHBand="0" w:noVBand="1" w:val="04A0"/>
+      </w:tblPr>
+      <w:tblGrid>
+        <w:gridCol w:w="9746"/>
+      </w:tblGrid>
+      <w:tr>
+        <w:tc>
+          <w:tcPr>
+            <w:tcW w:type="dxa" w:w="9746"/>
+            <w:shd w:val="clear" w:color="auto" w:fill="111827"/>
+            <w:tcBorders>
+              <w:top w:val="single" w:sz="6" w:space="0" w:color="1E2433"/>
+              <w:left w:val="single" w:sz="6" w:space="0" w:color="1E2433"/>
+              <w:bottom w:val="single" w:sz="6" w:space="0" w:color="1E2433"/>
+              <w:right w:val="single" w:sz="6" w:space="0" w:color="1E2433"/>
+            </w:tcBorders>
+          </w:tcPr>
+          <w:p>
+            <w:pPr>
+              <w:spacing w:before="80" w:after="80"/>
+            </w:pPr>
+            <w:r>
+              <w:rPr>
+                <w:rFonts w:ascii="Courier New" w:hAnsi="Courier New"/>
+                <w:b w:val="0"/>
+                <w:i w:val="0"/>
+                <w:color w:val="86EFAC"/>
+                <w:sz w:val="18"/>
+              </w:rPr>
+              <w:t># Step 1 — positional check (camera-agnostic)</w:t>
+              <w:br/>
+              <w:t>if hip_y &gt;= knee_y:          # hip NOT below knee</w:t>
+              <w:br/>
+              <w:t xml:space="preserve">    depth_classification = 'Warning'</w:t>
+              <w:br/>
+              <w:t xml:space="preserve">    depth_insufficient_flag = True</w:t>
+              <w:br/>
+              <w:br/>
+              <w:t># Step 2 — grade how deep (only if Step 1 passes)</w:t>
+              <w:br/>
+              <w:t>elif knee_angle &lt;= EXCELLENT_THRESHOLD:   # side ≤70°, front ≤90°</w:t>
+              <w:br/>
+              <w:t xml:space="preserve">    depth_classification = 'Excellent'</w:t>
+              <w:br/>
+              <w:t xml:space="preserve">    depth_insufficient_flag = False</w:t>
+              <w:br/>
+              <w:br/>
+              <w:t>else:                         # side 71–90°, front 91–105°</w:t>
+              <w:br/>
+              <w:t xml:space="preserve">    depth_classification = 'Good'</w:t>
+              <w:br/>
+              <w:t xml:space="preserve">    depth_insufficient_flag = False</w:t>
+            </w:r>
+          </w:p>
+        </w:tc>
+      </w:tr>
+    </w:tbl>
+    <w:p>
+      <w:pPr>
+        <w:spacing w:after="80"/>
+      </w:pPr>
+    </w:p>
+    <w:p>
+      <w:pPr>
+        <w:spacing w:before="120" w:after="120"/>
+        <w:pBdr>
+          <w:bottom w:val="single" w:sz="6" w:space="1" w:color="1E5BA8"/>
+        </w:pBdr>
+      </w:pPr>
+    </w:p>
+    <w:p>
+      <w:pPr>
+        <w:spacing w:before="200" w:after="60"/>
+      </w:pPr>
+      <w:r>
+        <w:rPr>
+          <w:rFonts w:ascii="Calibri" w:hAnsi="Calibri"/>
+          <w:b/>
+          <w:i w:val="0"/>
+          <w:color w:val="1E5BA8"/>
+          <w:sz w:val="24"/>
+        </w:rPr>
+        <w:t>Final sign-off table — depth classification</w:t>
+      </w:r>
+    </w:p>
+    <w:tbl>
+      <w:tblPr>
+        <w:tblStyle w:val="TableGrid"/>
+        <w:tblW w:type="auto" w:w="0"/>
+        <w:tblLook w:firstColumn="1" w:firstRow="1" w:lastColumn="0" w:lastRow="0" w:noHBand="0" w:noVBand="1" w:val="04A0"/>
+      </w:tblPr>
+      <w:tblGrid>
+        <w:gridCol w:w="2436"/>
+        <w:gridCol w:w="2436"/>
+        <w:gridCol w:w="2436"/>
+        <w:gridCol w:w="2436"/>
+      </w:tblGrid>
+      <w:tr>
+        <w:tc>
+          <w:tcPr>
+            <w:tcW w:type="dxa" w:w="1134"/>
+            <w:shd w:val="clear" w:color="auto" w:fill="0F274D"/>
+            <w:tcBorders>
+              <w:top w:val="single" w:sz="4" w:space="0" w:color="FFFFFF"/>
+              <w:left w:val="single" w:sz="4" w:space="0" w:color="FFFFFF"/>
+              <w:bottom w:val="single" w:sz="4" w:space="0" w:color="FFFFFF"/>
+              <w:right w:val="single" w:sz="4" w:space="0" w:color="FFFFFF"/>
+            </w:tcBorders>
+          </w:tcPr>
+          <w:p>
+            <w:pPr>
+              <w:jc w:val="center"/>
+            </w:pPr>
+            <w:r>
+              <w:rPr>
+                <w:rFonts w:ascii="Calibri" w:hAnsi="Calibri"/>
+                <w:b/>
+                <w:i w:val="0"/>
+                <w:color w:val="FFFFFF"/>
+                <w:sz w:val="18"/>
+              </w:rPr>
+              <w:t>Camera</w:t>
+            </w:r>
+          </w:p>
+        </w:tc>
+        <w:tc>
+          <w:tcPr>
+            <w:tcW w:type="dxa" w:w="1701"/>
+            <w:shd w:val="clear" w:color="auto" w:fill="0F274D"/>
+            <w:tcBorders>
+              <w:top w:val="single" w:sz="4" w:space="0" w:color="FFFFFF"/>
+              <w:left w:val="single" w:sz="4" w:space="0" w:color="FFFFFF"/>
+              <w:bottom w:val="single" w:sz="4" w:space="0" w:color="FFFFFF"/>
+              <w:right w:val="single" w:sz="4" w:space="0" w:color="FFFFFF"/>
+            </w:tcBorders>
+          </w:tcPr>
+          <w:p>
+            <w:pPr>
+              <w:jc w:val="center"/>
+            </w:pPr>
+            <w:r>
+              <w:rPr>
+                <w:rFonts w:ascii="Calibri" w:hAnsi="Calibri"/>
+                <w:b/>
+                <w:i w:val="0"/>
+                <w:color w:val="FFFFFF"/>
+                <w:sz w:val="18"/>
+              </w:rPr>
+              <w:t>Label</w:t>
+            </w:r>
+          </w:p>
+        </w:tc>
+        <w:tc>
+          <w:tcPr>
+            <w:tcW w:type="dxa" w:w="4819"/>
+            <w:shd w:val="clear" w:color="auto" w:fill="0F274D"/>
+            <w:tcBorders>
+              <w:top w:val="single" w:sz="4" w:space="0" w:color="FFFFFF"/>
+              <w:left w:val="single" w:sz="4" w:space="0" w:color="FFFFFF"/>
+              <w:bottom w:val="single" w:sz="4" w:space="0" w:color="FFFFFF"/>
+              <w:right w:val="single" w:sz="4" w:space="0" w:color="FFFFFF"/>
+            </w:tcBorders>
+          </w:tcPr>
+          <w:p>
+            <w:pPr>
+              <w:jc w:val="center"/>
+            </w:pPr>
+            <w:r>
+              <w:rPr>
+                <w:rFonts w:ascii="Calibri" w:hAnsi="Calibri"/>
+                <w:b/>
+                <w:i w:val="0"/>
+                <w:color w:val="FFFFFF"/>
+                <w:sz w:val="18"/>
+              </w:rPr>
+              <w:t>Logic / Threshold</w:t>
+            </w:r>
+          </w:p>
+        </w:tc>
+        <w:tc>
+          <w:tcPr>
+            <w:tcW w:type="dxa" w:w="1984"/>
+            <w:shd w:val="clear" w:color="auto" w:fill="0F274D"/>
+            <w:tcBorders>
+              <w:top w:val="single" w:sz="4" w:space="0" w:color="FFFFFF"/>
+              <w:left w:val="single" w:sz="4" w:space="0" w:color="FFFFFF"/>
+              <w:bottom w:val="single" w:sz="4" w:space="0" w:color="FFFFFF"/>
+              <w:right w:val="single" w:sz="4" w:space="0" w:color="FFFFFF"/>
+            </w:tcBorders>
+          </w:tcPr>
+          <w:p>
+            <w:pPr>
+              <w:jc w:val="center"/>
+            </w:pPr>
+            <w:r>
+              <w:rPr>
+                <w:rFonts w:ascii="Calibri" w:hAnsi="Calibri"/>
+                <w:b/>
+                <w:i w:val="0"/>
+                <w:color w:val="FFFFFF"/>
+                <w:sz w:val="18"/>
+              </w:rPr>
+              <w:t>Sign-off</w:t>
+            </w:r>
+          </w:p>
+        </w:tc>
+      </w:tr>
+      <w:tr>
+        <w:tc>
+          <w:tcPr>
+            <w:tcW w:type="dxa" w:w="1134"/>
+            <w:tcBorders>
+              <w:top w:val="single" w:sz="4" w:space="0" w:color="CCCCCC"/>
+              <w:left w:val="single" w:sz="4" w:space="0" w:color="CCCCCC"/>
+              <w:bottom w:val="single" w:sz="4" w:space="0" w:color="CCCCCC"/>
+              <w:right w:val="single" w:sz="4" w:space="0" w:color="CCCCCC"/>
+            </w:tcBorders>
+          </w:tcPr>
+          <w:p>
+            <w:pPr>
+              <w:jc w:val="left"/>
+            </w:pPr>
+            <w:r>
+              <w:rPr>
+                <w:rFonts w:ascii="Calibri" w:hAnsi="Calibri"/>
+                <w:b w:val="0"/>
+                <w:i w:val="0"/>
+                <w:color w:val="1C1C1C"/>
+                <w:sz w:val="18"/>
+              </w:rPr>
+              <w:t>Both</w:t>
+            </w:r>
+          </w:p>
+        </w:tc>
+        <w:tc>
+          <w:tcPr>
+            <w:tcW w:type="dxa" w:w="1701"/>
+            <w:shd w:val="clear" w:color="auto" w:fill="F8D0D0"/>
+            <w:tcBorders>
+              <w:top w:val="single" w:sz="4" w:space="0" w:color="CCCCCC"/>
+              <w:left w:val="single" w:sz="4" w:space="0" w:color="CCCCCC"/>
+              <w:bottom w:val="single" w:sz="4" w:space="0" w:color="CCCCCC"/>
+              <w:right w:val="single" w:sz="4" w:space="0" w:color="CCCCCC"/>
+            </w:tcBorders>
+          </w:tcPr>
+          <w:p>
+            <w:pPr>
+              <w:jc w:val="left"/>
+            </w:pPr>
+            <w:r>
+              <w:rPr>
+                <w:rFonts w:ascii="Calibri" w:hAnsi="Calibri"/>
+                <w:b w:val="0"/>
+                <w:i w:val="0"/>
+                <w:color w:val="C02020"/>
+                <w:sz w:val="18"/>
+              </w:rPr>
+              <w:t>Warning</w:t>
+            </w:r>
+          </w:p>
+        </w:tc>
+        <w:tc>
+          <w:tcPr>
+            <w:tcW w:type="dxa" w:w="4819"/>
+            <w:tcBorders>
+              <w:top w:val="single" w:sz="4" w:space="0" w:color="CCCCCC"/>
+              <w:left w:val="single" w:sz="4" w:space="0" w:color="CCCCCC"/>
+              <w:bottom w:val="single" w:sz="4" w:space="0" w:color="CCCCCC"/>
+              <w:right w:val="single" w:sz="4" w:space="0" w:color="CCCCCC"/>
+            </w:tcBorders>
+          </w:tcPr>
+          <w:p>
+            <w:pPr>
+              <w:jc w:val="left"/>
+            </w:pPr>
+            <w:r>
+              <w:rPr>
+                <w:rFonts w:ascii="Calibri" w:hAnsi="Calibri"/>
+                <w:b w:val="0"/>
+                <w:i w:val="0"/>
+                <w:color w:val="1C1C1C"/>
+                <w:sz w:val="18"/>
+              </w:rPr>
+              <w:t>Step 1: hip_y ≥ knee_y (hip not below knee)</w:t>
+            </w:r>
+          </w:p>
+        </w:tc>
+        <w:tc>
+          <w:tcPr>
+            <w:tcW w:type="dxa" w:w="1984"/>
+            <w:tcBorders>
+              <w:top w:val="single" w:sz="4" w:space="0" w:color="CCCCCC"/>
+              <w:left w:val="single" w:sz="4" w:space="0" w:color="CCCCCC"/>
+              <w:bottom w:val="single" w:sz="4" w:space="0" w:color="CCCCCC"/>
+              <w:right w:val="single" w:sz="4" w:space="0" w:color="CCCCCC"/>
+            </w:tcBorders>
+          </w:tcPr>
+          <w:p>
+            <w:pPr>
+              <w:jc w:val="left"/>
+            </w:pPr>
+            <w:r>
+              <w:rPr>
+                <w:rFonts w:ascii="Calibri" w:hAnsi="Calibri"/>
+                <w:b w:val="0"/>
+                <w:i w:val="0"/>
+                <w:color w:val="1C1C1C"/>
+                <w:sz w:val="18"/>
+              </w:rPr>
+            </w:r>
+          </w:p>
+        </w:tc>
+      </w:tr>
+      <w:tr>
+        <w:tc>
+          <w:tcPr>
+            <w:tcW w:type="dxa" w:w="1134"/>
+            <w:tcBorders>
+              <w:top w:val="single" w:sz="4" w:space="0" w:color="CCCCCC"/>
+              <w:left w:val="single" w:sz="4" w:space="0" w:color="CCCCCC"/>
+              <w:bottom w:val="single" w:sz="4" w:space="0" w:color="CCCCCC"/>
+              <w:right w:val="single" w:sz="4" w:space="0" w:color="CCCCCC"/>
+            </w:tcBorders>
+          </w:tcPr>
+          <w:p>
+            <w:pPr>
+              <w:jc w:val="left"/>
+            </w:pPr>
+            <w:r>
+              <w:rPr>
+                <w:rFonts w:ascii="Calibri" w:hAnsi="Calibri"/>
+                <w:b w:val="0"/>
+                <w:i w:val="0"/>
+                <w:color w:val="1C1C1C"/>
+                <w:sz w:val="18"/>
+              </w:rPr>
+              <w:t>Side</w:t>
+            </w:r>
+          </w:p>
+        </w:tc>
+        <w:tc>
+          <w:tcPr>
+            <w:tcW w:type="dxa" w:w="1701"/>
+            <w:shd w:val="clear" w:color="auto" w:fill="E0F4E8"/>
+            <w:tcBorders>
+              <w:top w:val="single" w:sz="4" w:space="0" w:color="CCCCCC"/>
+              <w:left w:val="single" w:sz="4" w:space="0" w:color="CCCCCC"/>
+              <w:bottom w:val="single" w:sz="4" w:space="0" w:color="CCCCCC"/>
+              <w:right w:val="single" w:sz="4" w:space="0" w:color="CCCCCC"/>
+            </w:tcBorders>
+          </w:tcPr>
+          <w:p>
+            <w:pPr>
+              <w:jc w:val="left"/>
+            </w:pPr>
+            <w:r>
+              <w:rPr>
+                <w:rFonts w:ascii="Calibri" w:hAnsi="Calibri"/>
+                <w:b w:val="0"/>
+                <w:i w:val="0"/>
+                <w:color w:val="1A6E2E"/>
+                <w:sz w:val="18"/>
+              </w:rPr>
+              <w:t>Excellent</w:t>
+            </w:r>
+          </w:p>
+        </w:tc>
+        <w:tc>
+          <w:tcPr>
+            <w:tcW w:type="dxa" w:w="4819"/>
+            <w:tcBorders>
+              <w:top w:val="single" w:sz="4" w:space="0" w:color="CCCCCC"/>
+              <w:left w:val="single" w:sz="4" w:space="0" w:color="CCCCCC"/>
+              <w:bottom w:val="single" w:sz="4" w:space="0" w:color="CCCCCC"/>
+              <w:right w:val="single" w:sz="4" w:space="0" w:color="CCCCCC"/>
+            </w:tcBorders>
+          </w:tcPr>
+          <w:p>
+            <w:pPr>
+              <w:jc w:val="left"/>
+            </w:pPr>
+            <w:r>
+              <w:rPr>
+                <w:rFonts w:ascii="Calibri" w:hAnsi="Calibri"/>
+                <w:b w:val="0"/>
+                <w:i w:val="0"/>
+                <w:color w:val="1C1C1C"/>
+                <w:sz w:val="18"/>
+              </w:rPr>
+              <w:t>Step 2: knee_angle ≤ 70° (MediaPipe interior)</w:t>
+            </w:r>
+          </w:p>
+        </w:tc>
+        <w:tc>
+          <w:tcPr>
+            <w:tcW w:type="dxa" w:w="1984"/>
+            <w:tcBorders>
+              <w:top w:val="single" w:sz="4" w:space="0" w:color="CCCCCC"/>
+              <w:left w:val="single" w:sz="4" w:space="0" w:color="CCCCCC"/>
+              <w:bottom w:val="single" w:sz="4" w:space="0" w:color="CCCCCC"/>
+              <w:right w:val="single" w:sz="4" w:space="0" w:color="CCCCCC"/>
+            </w:tcBorders>
+          </w:tcPr>
+          <w:p>
+            <w:pPr>
+              <w:jc w:val="left"/>
+            </w:pPr>
+            <w:r>
+              <w:rPr>
+                <w:rFonts w:ascii="Calibri" w:hAnsi="Calibri"/>
+                <w:b w:val="0"/>
+                <w:i w:val="0"/>
+                <w:color w:val="1C1C1C"/>
+                <w:sz w:val="18"/>
+              </w:rPr>
+            </w:r>
+          </w:p>
+        </w:tc>
+      </w:tr>
+      <w:tr>
+        <w:tc>
+          <w:tcPr>
+            <w:tcW w:type="dxa" w:w="1134"/>
+            <w:tcBorders>
+              <w:top w:val="single" w:sz="4" w:space="0" w:color="CCCCCC"/>
+              <w:left w:val="single" w:sz="4" w:space="0" w:color="CCCCCC"/>
+              <w:bottom w:val="single" w:sz="4" w:space="0" w:color="CCCCCC"/>
+              <w:right w:val="single" w:sz="4" w:space="0" w:color="CCCCCC"/>
+            </w:tcBorders>
+          </w:tcPr>
+          <w:p>
+            <w:pPr>
+              <w:jc w:val="left"/>
+            </w:pPr>
+            <w:r>
+              <w:rPr>
+                <w:rFonts w:ascii="Calibri" w:hAnsi="Calibri"/>
+                <w:b w:val="0"/>
+                <w:i w:val="0"/>
+                <w:color w:val="1C1C1C"/>
+                <w:sz w:val="18"/>
+              </w:rPr>
+              <w:t>Side</w:t>
+            </w:r>
+          </w:p>
+        </w:tc>
+        <w:tc>
+          <w:tcPr>
+            <w:tcW w:type="dxa" w:w="1701"/>
+            <w:shd w:val="clear" w:color="auto" w:fill="E0F4E8"/>
+            <w:tcBorders>
+              <w:top w:val="single" w:sz="4" w:space="0" w:color="CCCCCC"/>
+              <w:left w:val="single" w:sz="4" w:space="0" w:color="CCCCCC"/>
+              <w:bottom w:val="single" w:sz="4" w:space="0" w:color="CCCCCC"/>
+              <w:right w:val="single" w:sz="4" w:space="0" w:color="CCCCCC"/>
+            </w:tcBorders>
+          </w:tcPr>
+          <w:p>
+            <w:pPr>
+              <w:jc w:val="left"/>
+            </w:pPr>
+            <w:r>
+              <w:rPr>
+                <w:rFonts w:ascii="Calibri" w:hAnsi="Calibri"/>
+                <w:b w:val="0"/>
+                <w:i w:val="0"/>
+                <w:color w:val="1A6E2E"/>
+                <w:sz w:val="18"/>
+              </w:rPr>
+              <w:t>Good</w:t>
+            </w:r>
+          </w:p>
+        </w:tc>
+        <w:tc>
+          <w:tcPr>
+            <w:tcW w:type="dxa" w:w="4819"/>
+            <w:tcBorders>
+              <w:top w:val="single" w:sz="4" w:space="0" w:color="CCCCCC"/>
+              <w:left w:val="single" w:sz="4" w:space="0" w:color="CCCCCC"/>
+              <w:bottom w:val="single" w:sz="4" w:space="0" w:color="CCCCCC"/>
+              <w:right w:val="single" w:sz="4" w:space="0" w:color="CCCCCC"/>
+            </w:tcBorders>
+          </w:tcPr>
+          <w:p>
+            <w:pPr>
+              <w:jc w:val="left"/>
+            </w:pPr>
+            <w:r>
+              <w:rPr>
+                <w:rFonts w:ascii="Calibri" w:hAnsi="Calibri"/>
+                <w:b w:val="0"/>
+                <w:i w:val="0"/>
+                <w:color w:val="1C1C1C"/>
+                <w:sz w:val="18"/>
+              </w:rPr>
+              <w:t>Step 2: knee_angle 71–90° (MediaPipe interior)</w:t>
+            </w:r>
+          </w:p>
+        </w:tc>
+        <w:tc>
+          <w:tcPr>
+            <w:tcW w:type="dxa" w:w="1984"/>
+            <w:tcBorders>
+              <w:top w:val="single" w:sz="4" w:space="0" w:color="CCCCCC"/>
+              <w:left w:val="single" w:sz="4" w:space="0" w:color="CCCCCC"/>
+              <w:bottom w:val="single" w:sz="4" w:space="0" w:color="CCCCCC"/>
+              <w:right w:val="single" w:sz="4" w:space="0" w:color="CCCCCC"/>
+            </w:tcBorders>
+          </w:tcPr>
+          <w:p>
+            <w:pPr>
+              <w:jc w:val="left"/>
+            </w:pPr>
+            <w:r>
+              <w:rPr>
+                <w:rFonts w:ascii="Calibri" w:hAnsi="Calibri"/>
+                <w:b w:val="0"/>
+                <w:i w:val="0"/>
+                <w:color w:val="1C1C1C"/>
+                <w:sz w:val="18"/>
+              </w:rPr>
+            </w:r>
+          </w:p>
+        </w:tc>
+      </w:tr>
+      <w:tr>
+        <w:tc>
+          <w:tcPr>
+            <w:tcW w:type="dxa" w:w="1134"/>
+            <w:tcBorders>
+              <w:top w:val="single" w:sz="4" w:space="0" w:color="CCCCCC"/>
+              <w:left w:val="single" w:sz="4" w:space="0" w:color="CCCCCC"/>
+              <w:bottom w:val="single" w:sz="4" w:space="0" w:color="CCCCCC"/>
+              <w:right w:val="single" w:sz="4" w:space="0" w:color="CCCCCC"/>
+            </w:tcBorders>
+          </w:tcPr>
+          <w:p>
+            <w:pPr>
+              <w:jc w:val="left"/>
+            </w:pPr>
+            <w:r>
+              <w:rPr>
+                <w:rFonts w:ascii="Calibri" w:hAnsi="Calibri"/>
+                <w:b w:val="0"/>
+                <w:i w:val="0"/>
+                <w:color w:val="1C1C1C"/>
+                <w:sz w:val="18"/>
+              </w:rPr>
+              <w:t>Front</w:t>
+            </w:r>
+          </w:p>
+        </w:tc>
+        <w:tc>
+          <w:tcPr>
+            <w:tcW w:type="dxa" w:w="1701"/>
+            <w:shd w:val="clear" w:color="auto" w:fill="E0F4E8"/>
+            <w:tcBorders>
+              <w:top w:val="single" w:sz="4" w:space="0" w:color="CCCCCC"/>
+              <w:left w:val="single" w:sz="4" w:space="0" w:color="CCCCCC"/>
+              <w:bottom w:val="single" w:sz="4" w:space="0" w:color="CCCCCC"/>
+              <w:right w:val="single" w:sz="4" w:space="0" w:color="CCCCCC"/>
+            </w:tcBorders>
+          </w:tcPr>
+          <w:p>
+            <w:pPr>
+              <w:jc w:val="left"/>
+            </w:pPr>
+            <w:r>
+              <w:rPr>
+                <w:rFonts w:ascii="Calibri" w:hAnsi="Calibri"/>
+                <w:b w:val="0"/>
+                <w:i w:val="0"/>
+                <w:color w:val="1A6E2E"/>
+                <w:sz w:val="18"/>
+              </w:rPr>
+              <w:t>Excellent</w:t>
+            </w:r>
+          </w:p>
+        </w:tc>
+        <w:tc>
+          <w:tcPr>
+            <w:tcW w:type="dxa" w:w="4819"/>
+            <w:tcBorders>
+              <w:top w:val="single" w:sz="4" w:space="0" w:color="CCCCCC"/>
+              <w:left w:val="single" w:sz="4" w:space="0" w:color="CCCCCC"/>
+              <w:bottom w:val="single" w:sz="4" w:space="0" w:color="CCCCCC"/>
+              <w:right w:val="single" w:sz="4" w:space="0" w:color="CCCCCC"/>
+            </w:tcBorders>
+          </w:tcPr>
+          <w:p>
+            <w:pPr>
+              <w:jc w:val="left"/>
+            </w:pPr>
+            <w:r>
+              <w:rPr>
+                <w:rFonts w:ascii="Calibri" w:hAnsi="Calibri"/>
+                <w:b w:val="0"/>
+                <w:i w:val="0"/>
+                <w:color w:val="1C1C1C"/>
+                <w:sz w:val="18"/>
+              </w:rPr>
+              <w:t>Step 2: knee_angle ≤ 90° (MediaPipe interior)</w:t>
+            </w:r>
+          </w:p>
+        </w:tc>
+        <w:tc>
+          <w:tcPr>
+            <w:tcW w:type="dxa" w:w="1984"/>
+            <w:tcBorders>
+              <w:top w:val="single" w:sz="4" w:space="0" w:color="CCCCCC"/>
+              <w:left w:val="single" w:sz="4" w:space="0" w:color="CCCCCC"/>
+              <w:bottom w:val="single" w:sz="4" w:space="0" w:color="CCCCCC"/>
+              <w:right w:val="single" w:sz="4" w:space="0" w:color="CCCCCC"/>
+            </w:tcBorders>
+          </w:tcPr>
+          <w:p>
+            <w:pPr>
+              <w:jc w:val="left"/>
+            </w:pPr>
+            <w:r>
+              <w:rPr>
+                <w:rFonts w:ascii="Calibri" w:hAnsi="Calibri"/>
+                <w:b w:val="0"/>
+                <w:i w:val="0"/>
+                <w:color w:val="1C1C1C"/>
+                <w:sz w:val="18"/>
+              </w:rPr>
+            </w:r>
+          </w:p>
+        </w:tc>
+      </w:tr>
+      <w:tr>
+        <w:tc>
+          <w:tcPr>
+            <w:tcW w:type="dxa" w:w="1134"/>
+            <w:tcBorders>
+              <w:top w:val="single" w:sz="4" w:space="0" w:color="CCCCCC"/>
+              <w:left w:val="single" w:sz="4" w:space="0" w:color="CCCCCC"/>
+              <w:bottom w:val="single" w:sz="4" w:space="0" w:color="CCCCCC"/>
+              <w:right w:val="single" w:sz="4" w:space="0" w:color="CCCCCC"/>
+            </w:tcBorders>
+          </w:tcPr>
+          <w:p>
+            <w:pPr>
+              <w:jc w:val="left"/>
+            </w:pPr>
+            <w:r>
+              <w:rPr>
+                <w:rFonts w:ascii="Calibri" w:hAnsi="Calibri"/>
+                <w:b w:val="0"/>
+                <w:i w:val="0"/>
+                <w:color w:val="1C1C1C"/>
+                <w:sz w:val="18"/>
+              </w:rPr>
+              <w:t>Front</w:t>
+            </w:r>
+          </w:p>
+        </w:tc>
+        <w:tc>
+          <w:tcPr>
+            <w:tcW w:type="dxa" w:w="1701"/>
+            <w:shd w:val="clear" w:color="auto" w:fill="E0F4E8"/>
+            <w:tcBorders>
+              <w:top w:val="single" w:sz="4" w:space="0" w:color="CCCCCC"/>
+              <w:left w:val="single" w:sz="4" w:space="0" w:color="CCCCCC"/>
+              <w:bottom w:val="single" w:sz="4" w:space="0" w:color="CCCCCC"/>
+              <w:right w:val="single" w:sz="4" w:space="0" w:color="CCCCCC"/>
+            </w:tcBorders>
+          </w:tcPr>
+          <w:p>
+            <w:pPr>
+              <w:jc w:val="left"/>
+            </w:pPr>
+            <w:r>
+              <w:rPr>
+                <w:rFonts w:ascii="Calibri" w:hAnsi="Calibri"/>
+                <w:b w:val="0"/>
+                <w:i w:val="0"/>
+                <w:color w:val="1A6E2E"/>
+                <w:sz w:val="18"/>
+              </w:rPr>
+              <w:t>Good</w:t>
+            </w:r>
+          </w:p>
+        </w:tc>
+        <w:tc>
+          <w:tcPr>
+            <w:tcW w:type="dxa" w:w="4819"/>
+            <w:tcBorders>
+              <w:top w:val="single" w:sz="4" w:space="0" w:color="CCCCCC"/>
+              <w:left w:val="single" w:sz="4" w:space="0" w:color="CCCCCC"/>
+              <w:bottom w:val="single" w:sz="4" w:space="0" w:color="CCCCCC"/>
+              <w:right w:val="single" w:sz="4" w:space="0" w:color="CCCCCC"/>
+            </w:tcBorders>
+          </w:tcPr>
+          <w:p>
+            <w:pPr>
+              <w:jc w:val="left"/>
+            </w:pPr>
+            <w:r>
+              <w:rPr>
+                <w:rFonts w:ascii="Calibri" w:hAnsi="Calibri"/>
+                <w:b w:val="0"/>
+                <w:i w:val="0"/>
+                <w:color w:val="1C1C1C"/>
+                <w:sz w:val="18"/>
+              </w:rPr>
+              <w:t>Step 2: knee_angle 91–105° (MediaPipe interior)</w:t>
+            </w:r>
+          </w:p>
+        </w:tc>
+        <w:tc>
+          <w:tcPr>
+            <w:tcW w:type="dxa" w:w="1984"/>
+            <w:tcBorders>
+              <w:top w:val="single" w:sz="4" w:space="0" w:color="CCCCCC"/>
+              <w:left w:val="single" w:sz="4" w:space="0" w:color="CCCCCC"/>
+              <w:bottom w:val="single" w:sz="4" w:space="0" w:color="CCCCCC"/>
+              <w:right w:val="single" w:sz="4" w:space="0" w:color="CCCCCC"/>
+            </w:tcBorders>
+          </w:tcPr>
+          <w:p>
+            <w:pPr>
+              <w:jc w:val="left"/>
+            </w:pPr>
+            <w:r>
+              <w:rPr>
+                <w:rFonts w:ascii="Calibri" w:hAnsi="Calibri"/>
+                <w:b w:val="0"/>
+                <w:i w:val="0"/>
+                <w:color w:val="1C1C1C"/>
+                <w:sz w:val="18"/>
+              </w:rPr>
+            </w:r>
+          </w:p>
+        </w:tc>
+      </w:tr>
+    </w:tbl>
+    <w:p>
+      <w:pPr>
+        <w:spacing w:after="80"/>
+      </w:pPr>
+    </w:p>
+    <w:p>
+      <w:pPr>
+        <w:spacing w:before="20" w:after="80"/>
+      </w:pPr>
+      <w:r>
+        <w:rPr>
+          <w:rFonts w:ascii="Calibri" w:hAnsi="Calibri"/>
+          <w:b w:val="0"/>
+          <w:i w:val="0"/>
+          <w:color w:val="555555"/>
+          <w:sz w:val="18"/>
+        </w:rPr>
+        <w:t>MD 5-grade system (Excellent/Good/Mild/Moderate/Severe) — unchanged, used by LLM only.</w:t>
+      </w:r>
+    </w:p>
+    <w:p>
+      <w:pPr>
+        <w:spacing w:before="240"/>
+      </w:pPr>
+      <w:r>
+        <w:rPr>
+          <w:rFonts w:ascii="Calibri" w:hAnsi="Calibri"/>
+          <w:b w:val="0"/>
+          <w:i/>
+          <w:color w:val="555555"/>
+          <w:sz w:val="16"/>
+        </w:rPr>
+        <w:t>Kinetic  ·  Threshold Alignment Brief  ·  Depth — Logic  ·  May 2026</w:t>
       </w:r>
     </w:p>
     <w:sectPr>

</xml_diff>

<commit_message>
Threshold Alignment: add side camera valgus handling
Side camera: valgus cannot be detected from 2D pose estimation.
Frontal-plane movement is invisible from the side; MediaPipe z-axis
error too high to infer it.

Agreed handling:
- Biomechanics script: stability_data null for side camera — correct as-is
- OpenCV image: no valgus label shown on side-camera images
- Haiku coaching: if RC1 confirmed, note valgus as potential downstream
  risk only ('ankle restriction often causes knees to cave inward —
  front camera would confirm'). Do not score.
- Results screen: inline note 'Knee tracking not assessed — requires
  front-camera footage'
- System prompt: add note to RC2 section for side camera handling

Co-Authored-By: Claude Sonnet 4.6 <noreply@anthropic.com>
</commit_message>
<xml_diff>
--- a/Kinetic_Threshold_Alignment.docx
+++ b/Kinetic_Threshold_Alignment.docx
@@ -24283,6 +24283,782 @@
           <w:sz w:val="16"/>
         </w:rPr>
         <w:t>Kinetic  ·  Threshold Alignment Brief  ·  Valgus + Full Summary  ·  v0.1  ·  May 2026</w:t>
+      </w:r>
+    </w:p>
+    <w:p>
+      <w:pPr>
+        <w:spacing w:before="120" w:after="120"/>
+        <w:pBdr>
+          <w:bottom w:val="single" w:sz="6" w:space="1" w:color="1E5BA8"/>
+        </w:pBdr>
+      </w:pPr>
+    </w:p>
+    <w:p>
+      <w:pPr>
+        <w:spacing w:before="200" w:after="60"/>
+      </w:pPr>
+      <w:r>
+        <w:rPr>
+          <w:rFonts w:ascii="Calibri" w:hAnsi="Calibri"/>
+          <w:b/>
+          <w:color w:val="1E5BA8"/>
+          <w:sz w:val="24"/>
+        </w:rPr>
+        <w:t>Side camera — valgus handling</w:t>
+      </w:r>
+    </w:p>
+    <w:tbl>
+      <w:tblPr>
+        <w:tblStyle w:val="TableGrid"/>
+        <w:tblW w:type="auto" w:w="0"/>
+        <w:tblLook w:firstColumn="1" w:firstRow="1" w:lastColumn="0" w:lastRow="0" w:noHBand="0" w:noVBand="1" w:val="04A0"/>
+      </w:tblPr>
+      <w:tblGrid>
+        <w:gridCol w:w="9746"/>
+      </w:tblGrid>
+      <w:tr>
+        <w:tc>
+          <w:tcPr>
+            <w:tcW w:type="dxa" w:w="9746"/>
+            <w:shd w:val="clear" w:color="auto" w:fill="E8F0FE"/>
+            <w:tcBorders>
+              <w:top w:val="single" w:sz="6" w:space="0" w:color="AAAAAA"/>
+              <w:left w:val="single" w:sz="6" w:space="0" w:color="AAAAAA"/>
+              <w:bottom w:val="single" w:sz="6" w:space="0" w:color="AAAAAA"/>
+              <w:right w:val="single" w:sz="6" w:space="0" w:color="AAAAAA"/>
+            </w:tcBorders>
+          </w:tcPr>
+          <w:p>
+            <w:pPr>
+              <w:spacing w:before="40" w:after="40"/>
+            </w:pPr>
+            <w:r>
+              <w:rPr>
+                <w:rFonts w:ascii="Calibri" w:hAnsi="Calibri"/>
+                <w:b/>
+                <w:color w:val="1E5BA8"/>
+                <w:sz w:val="20"/>
+              </w:rPr>
+              <w:t xml:space="preserve">Why valgus cannot be detected from side camera:  </w:t>
+            </w:r>
+            <w:r>
+              <w:rPr>
+                <w:rFonts w:ascii="Calibri" w:hAnsi="Calibri"/>
+                <w:b w:val="0"/>
+                <w:color w:val="1C1C1C"/>
+                <w:sz w:val="20"/>
+              </w:rPr>
+              <w:t>Valgus (knee caving inward) is a frontal-plane movement. From a side view the inward collapse is invisible in the 2D projection — MediaPipe z-axis estimation is too unreliable to infer it. Haiku is already instructed not to score metrics marked ❌ for the current camera angle.</w:t>
+            </w:r>
+          </w:p>
+        </w:tc>
+      </w:tr>
+    </w:tbl>
+    <w:p>
+      <w:pPr>
+        <w:spacing w:after="80"/>
+      </w:pPr>
+    </w:p>
+    <w:p>
+      <w:pPr>
+        <w:spacing w:before="20" w:after="80"/>
+      </w:pPr>
+      <w:r>
+        <w:rPr>
+          <w:rFonts w:ascii="Calibri" w:hAnsi="Calibri"/>
+          <w:b w:val="0"/>
+          <w:color w:val="1C1C1C"/>
+          <w:sz w:val="20"/>
+        </w:rPr>
+        <w:t>What IS visible from side camera that relates to valgus:</w:t>
+      </w:r>
+    </w:p>
+    <w:tbl>
+      <w:tblPr>
+        <w:tblStyle w:val="TableGrid"/>
+        <w:tblW w:type="auto" w:w="0"/>
+        <w:tblLook w:firstColumn="1" w:firstRow="1" w:lastColumn="0" w:lastRow="0" w:noHBand="0" w:noVBand="1" w:val="04A0"/>
+      </w:tblPr>
+      <w:tblGrid>
+        <w:gridCol w:w="3249"/>
+        <w:gridCol w:w="3249"/>
+        <w:gridCol w:w="3249"/>
+      </w:tblGrid>
+      <w:tr>
+        <w:tc>
+          <w:tcPr>
+            <w:tcW w:type="dxa" w:w="2835"/>
+            <w:shd w:val="clear" w:color="auto" w:fill="0F274D"/>
+            <w:tcBorders>
+              <w:top w:val="single" w:sz="4" w:space="0" w:color="FFFFFF"/>
+              <w:left w:val="single" w:sz="4" w:space="0" w:color="FFFFFF"/>
+              <w:bottom w:val="single" w:sz="4" w:space="0" w:color="FFFFFF"/>
+              <w:right w:val="single" w:sz="4" w:space="0" w:color="FFFFFF"/>
+            </w:tcBorders>
+          </w:tcPr>
+          <w:p>
+            <w:pPr>
+              <w:jc w:val="center"/>
+            </w:pPr>
+            <w:r>
+              <w:rPr>
+                <w:rFonts w:ascii="Calibri" w:hAnsi="Calibri"/>
+                <w:b/>
+                <w:color w:val="FFFFFF"/>
+                <w:sz w:val="18"/>
+              </w:rPr>
+              <w:t>Signal</w:t>
+            </w:r>
+          </w:p>
+        </w:tc>
+        <w:tc>
+          <w:tcPr>
+            <w:tcW w:type="dxa" w:w="2268"/>
+            <w:shd w:val="clear" w:color="auto" w:fill="0F274D"/>
+            <w:tcBorders>
+              <w:top w:val="single" w:sz="4" w:space="0" w:color="FFFFFF"/>
+              <w:left w:val="single" w:sz="4" w:space="0" w:color="FFFFFF"/>
+              <w:bottom w:val="single" w:sz="4" w:space="0" w:color="FFFFFF"/>
+              <w:right w:val="single" w:sz="4" w:space="0" w:color="FFFFFF"/>
+            </w:tcBorders>
+          </w:tcPr>
+          <w:p>
+            <w:pPr>
+              <w:jc w:val="center"/>
+            </w:pPr>
+            <w:r>
+              <w:rPr>
+                <w:rFonts w:ascii="Calibri" w:hAnsi="Calibri"/>
+                <w:b/>
+                <w:color w:val="FFFFFF"/>
+                <w:sz w:val="18"/>
+              </w:rPr>
+              <w:t>Visible from side?</w:t>
+            </w:r>
+          </w:p>
+        </w:tc>
+        <w:tc>
+          <w:tcPr>
+            <w:tcW w:type="dxa" w:w="4535"/>
+            <w:shd w:val="clear" w:color="auto" w:fill="0F274D"/>
+            <w:tcBorders>
+              <w:top w:val="single" w:sz="4" w:space="0" w:color="FFFFFF"/>
+              <w:left w:val="single" w:sz="4" w:space="0" w:color="FFFFFF"/>
+              <w:bottom w:val="single" w:sz="4" w:space="0" w:color="FFFFFF"/>
+              <w:right w:val="single" w:sz="4" w:space="0" w:color="FFFFFF"/>
+            </w:tcBorders>
+          </w:tcPr>
+          <w:p>
+            <w:pPr>
+              <w:jc w:val="center"/>
+            </w:pPr>
+            <w:r>
+              <w:rPr>
+                <w:rFonts w:ascii="Calibri" w:hAnsi="Calibri"/>
+                <w:b/>
+                <w:color w:val="FFFFFF"/>
+                <w:sz w:val="18"/>
+              </w:rPr>
+              <w:t>Link to valgus</w:t>
+            </w:r>
+          </w:p>
+        </w:tc>
+      </w:tr>
+      <w:tr>
+        <w:tc>
+          <w:tcPr>
+            <w:tcW w:type="dxa" w:w="2835"/>
+            <w:tcBorders>
+              <w:top w:val="single" w:sz="4" w:space="0" w:color="CCCCCC"/>
+              <w:left w:val="single" w:sz="4" w:space="0" w:color="CCCCCC"/>
+              <w:bottom w:val="single" w:sz="4" w:space="0" w:color="CCCCCC"/>
+              <w:right w:val="single" w:sz="4" w:space="0" w:color="CCCCCC"/>
+            </w:tcBorders>
+          </w:tcPr>
+          <w:p>
+            <w:r>
+              <w:rPr>
+                <w:rFonts w:ascii="Calibri" w:hAnsi="Calibri"/>
+                <w:b w:val="0"/>
+                <w:color w:val="1C1C1C"/>
+                <w:sz w:val="18"/>
+              </w:rPr>
+              <w:t>Ankle dorsiflexion restriction</w:t>
+            </w:r>
+          </w:p>
+        </w:tc>
+        <w:tc>
+          <w:tcPr>
+            <w:tcW w:type="dxa" w:w="2268"/>
+            <w:shd w:val="clear" w:color="auto" w:fill="E0F4E8"/>
+            <w:tcBorders>
+              <w:top w:val="single" w:sz="4" w:space="0" w:color="CCCCCC"/>
+              <w:left w:val="single" w:sz="4" w:space="0" w:color="CCCCCC"/>
+              <w:bottom w:val="single" w:sz="4" w:space="0" w:color="CCCCCC"/>
+              <w:right w:val="single" w:sz="4" w:space="0" w:color="CCCCCC"/>
+            </w:tcBorders>
+          </w:tcPr>
+          <w:p>
+            <w:r>
+              <w:rPr>
+                <w:rFonts w:ascii="Calibri" w:hAnsi="Calibri"/>
+                <w:b w:val="0"/>
+                <w:color w:val="1A6E2E"/>
+                <w:sz w:val="18"/>
+              </w:rPr>
+              <w:t>✅ Yes — measured</w:t>
+            </w:r>
+          </w:p>
+        </w:tc>
+        <w:tc>
+          <w:tcPr>
+            <w:tcW w:type="dxa" w:w="4535"/>
+            <w:tcBorders>
+              <w:top w:val="single" w:sz="4" w:space="0" w:color="CCCCCC"/>
+              <w:left w:val="single" w:sz="4" w:space="0" w:color="CCCCCC"/>
+              <w:bottom w:val="single" w:sz="4" w:space="0" w:color="CCCCCC"/>
+              <w:right w:val="single" w:sz="4" w:space="0" w:color="CCCCCC"/>
+            </w:tcBorders>
+          </w:tcPr>
+          <w:p>
+            <w:r>
+              <w:rPr>
+                <w:rFonts w:ascii="Calibri" w:hAnsi="Calibri"/>
+                <w:b w:val="0"/>
+                <w:color w:val="1C1C1C"/>
+                <w:sz w:val="18"/>
+              </w:rPr>
+              <w:t>RC1 → downstream valgus. If ankle is restricted, valgus is a likely downstream effect.</w:t>
+            </w:r>
+          </w:p>
+        </w:tc>
+      </w:tr>
+      <w:tr>
+        <w:tc>
+          <w:tcPr>
+            <w:tcW w:type="dxa" w:w="2835"/>
+            <w:tcBorders>
+              <w:top w:val="single" w:sz="4" w:space="0" w:color="CCCCCC"/>
+              <w:left w:val="single" w:sz="4" w:space="0" w:color="CCCCCC"/>
+              <w:bottom w:val="single" w:sz="4" w:space="0" w:color="CCCCCC"/>
+              <w:right w:val="single" w:sz="4" w:space="0" w:color="CCCCCC"/>
+            </w:tcBorders>
+          </w:tcPr>
+          <w:p>
+            <w:r>
+              <w:rPr>
+                <w:rFonts w:ascii="Calibri" w:hAnsi="Calibri"/>
+                <w:b w:val="0"/>
+                <w:color w:val="1C1C1C"/>
+                <w:sz w:val="18"/>
+              </w:rPr>
+              <w:t>Heel rise</w:t>
+            </w:r>
+          </w:p>
+        </w:tc>
+        <w:tc>
+          <w:tcPr>
+            <w:tcW w:type="dxa" w:w="2268"/>
+            <w:shd w:val="clear" w:color="auto" w:fill="E0F4E8"/>
+            <w:tcBorders>
+              <w:top w:val="single" w:sz="4" w:space="0" w:color="CCCCCC"/>
+              <w:left w:val="single" w:sz="4" w:space="0" w:color="CCCCCC"/>
+              <w:bottom w:val="single" w:sz="4" w:space="0" w:color="CCCCCC"/>
+              <w:right w:val="single" w:sz="4" w:space="0" w:color="CCCCCC"/>
+            </w:tcBorders>
+          </w:tcPr>
+          <w:p>
+            <w:r>
+              <w:rPr>
+                <w:rFonts w:ascii="Calibri" w:hAnsi="Calibri"/>
+                <w:b w:val="0"/>
+                <w:color w:val="1A6E2E"/>
+                <w:sz w:val="18"/>
+              </w:rPr>
+              <w:t>✅ Yes — visible</w:t>
+            </w:r>
+          </w:p>
+        </w:tc>
+        <w:tc>
+          <w:tcPr>
+            <w:tcW w:type="dxa" w:w="4535"/>
+            <w:tcBorders>
+              <w:top w:val="single" w:sz="4" w:space="0" w:color="CCCCCC"/>
+              <w:left w:val="single" w:sz="4" w:space="0" w:color="CCCCCC"/>
+              <w:bottom w:val="single" w:sz="4" w:space="0" w:color="CCCCCC"/>
+              <w:right w:val="single" w:sz="4" w:space="0" w:color="CCCCCC"/>
+            </w:tcBorders>
+          </w:tcPr>
+          <w:p>
+            <w:r>
+              <w:rPr>
+                <w:rFonts w:ascii="Calibri" w:hAnsi="Calibri"/>
+                <w:b w:val="0"/>
+                <w:color w:val="1C1C1C"/>
+                <w:sz w:val="18"/>
+              </w:rPr>
+              <w:t>Same RC1 chain — confirms ankle restriction severity.</w:t>
+            </w:r>
+          </w:p>
+        </w:tc>
+      </w:tr>
+      <w:tr>
+        <w:tc>
+          <w:tcPr>
+            <w:tcW w:type="dxa" w:w="2835"/>
+            <w:tcBorders>
+              <w:top w:val="single" w:sz="4" w:space="0" w:color="CCCCCC"/>
+              <w:left w:val="single" w:sz="4" w:space="0" w:color="CCCCCC"/>
+              <w:bottom w:val="single" w:sz="4" w:space="0" w:color="CCCCCC"/>
+              <w:right w:val="single" w:sz="4" w:space="0" w:color="CCCCCC"/>
+            </w:tcBorders>
+          </w:tcPr>
+          <w:p>
+            <w:r>
+              <w:rPr>
+                <w:rFonts w:ascii="Calibri" w:hAnsi="Calibri"/>
+                <w:b w:val="0"/>
+                <w:color w:val="1C1C1C"/>
+                <w:sz w:val="18"/>
+              </w:rPr>
+              <w:t>Actual medial knee collapse</w:t>
+            </w:r>
+          </w:p>
+        </w:tc>
+        <w:tc>
+          <w:tcPr>
+            <w:tcW w:type="dxa" w:w="2268"/>
+            <w:shd w:val="clear" w:color="auto" w:fill="FAE0E0"/>
+            <w:tcBorders>
+              <w:top w:val="single" w:sz="4" w:space="0" w:color="CCCCCC"/>
+              <w:left w:val="single" w:sz="4" w:space="0" w:color="CCCCCC"/>
+              <w:bottom w:val="single" w:sz="4" w:space="0" w:color="CCCCCC"/>
+              <w:right w:val="single" w:sz="4" w:space="0" w:color="CCCCCC"/>
+            </w:tcBorders>
+          </w:tcPr>
+          <w:p>
+            <w:r>
+              <w:rPr>
+                <w:rFonts w:ascii="Calibri" w:hAnsi="Calibri"/>
+                <w:b w:val="0"/>
+                <w:color w:val="C02020"/>
+                <w:sz w:val="18"/>
+              </w:rPr>
+              <w:t>❌ Not detectable</w:t>
+            </w:r>
+          </w:p>
+        </w:tc>
+        <w:tc>
+          <w:tcPr>
+            <w:tcW w:type="dxa" w:w="4535"/>
+            <w:tcBorders>
+              <w:top w:val="single" w:sz="4" w:space="0" w:color="CCCCCC"/>
+              <w:left w:val="single" w:sz="4" w:space="0" w:color="CCCCCC"/>
+              <w:bottom w:val="single" w:sz="4" w:space="0" w:color="CCCCCC"/>
+              <w:right w:val="single" w:sz="4" w:space="0" w:color="CCCCCC"/>
+            </w:tcBorders>
+          </w:tcPr>
+          <w:p>
+            <w:r>
+              <w:rPr>
+                <w:rFonts w:ascii="Calibri" w:hAnsi="Calibri"/>
+                <w:b w:val="0"/>
+                <w:color w:val="1C1C1C"/>
+                <w:sz w:val="18"/>
+              </w:rPr>
+              <w:t>Frontal-plane movement is invisible from the side. Do not score or comment.</w:t>
+            </w:r>
+          </w:p>
+        </w:tc>
+      </w:tr>
+    </w:tbl>
+    <w:p>
+      <w:pPr>
+        <w:spacing w:after="80"/>
+      </w:pPr>
+    </w:p>
+    <w:p>
+      <w:pPr>
+        <w:spacing w:before="20" w:after="80"/>
+      </w:pPr>
+      <w:r>
+        <w:rPr>
+          <w:rFonts w:ascii="Calibri" w:hAnsi="Calibri"/>
+          <w:b w:val="0"/>
+          <w:color w:val="1C1C1C"/>
+          <w:sz w:val="20"/>
+        </w:rPr>
+        <w:t>Agreed handling for side camera sessions:</w:t>
+      </w:r>
+    </w:p>
+    <w:tbl>
+      <w:tblPr>
+        <w:tblStyle w:val="TableGrid"/>
+        <w:tblW w:type="auto" w:w="0"/>
+        <w:tblLook w:firstColumn="1" w:firstRow="1" w:lastColumn="0" w:lastRow="0" w:noHBand="0" w:noVBand="1" w:val="04A0"/>
+      </w:tblPr>
+      <w:tblGrid>
+        <w:gridCol w:w="4873"/>
+        <w:gridCol w:w="4873"/>
+      </w:tblGrid>
+      <w:tr>
+        <w:tc>
+          <w:tcPr>
+            <w:tcW w:type="dxa" w:w="2551"/>
+            <w:shd w:val="clear" w:color="auto" w:fill="0F274D"/>
+            <w:tcBorders>
+              <w:top w:val="single" w:sz="4" w:space="0" w:color="FFFFFF"/>
+              <w:left w:val="single" w:sz="4" w:space="0" w:color="FFFFFF"/>
+              <w:bottom w:val="single" w:sz="4" w:space="0" w:color="FFFFFF"/>
+              <w:right w:val="single" w:sz="4" w:space="0" w:color="FFFFFF"/>
+            </w:tcBorders>
+          </w:tcPr>
+          <w:p>
+            <w:pPr>
+              <w:jc w:val="center"/>
+            </w:pPr>
+            <w:r>
+              <w:rPr>
+                <w:rFonts w:ascii="Calibri" w:hAnsi="Calibri"/>
+                <w:b/>
+                <w:color w:val="FFFFFF"/>
+                <w:sz w:val="18"/>
+              </w:rPr>
+              <w:t>Layer</w:t>
+            </w:r>
+          </w:p>
+        </w:tc>
+        <w:tc>
+          <w:tcPr>
+            <w:tcW w:type="dxa" w:w="7087"/>
+            <w:shd w:val="clear" w:color="auto" w:fill="0F274D"/>
+            <w:tcBorders>
+              <w:top w:val="single" w:sz="4" w:space="0" w:color="FFFFFF"/>
+              <w:left w:val="single" w:sz="4" w:space="0" w:color="FFFFFF"/>
+              <w:bottom w:val="single" w:sz="4" w:space="0" w:color="FFFFFF"/>
+              <w:right w:val="single" w:sz="4" w:space="0" w:color="FFFFFF"/>
+            </w:tcBorders>
+          </w:tcPr>
+          <w:p>
+            <w:pPr>
+              <w:jc w:val="center"/>
+            </w:pPr>
+            <w:r>
+              <w:rPr>
+                <w:rFonts w:ascii="Calibri" w:hAnsi="Calibri"/>
+                <w:b/>
+                <w:color w:val="FFFFFF"/>
+                <w:sz w:val="18"/>
+              </w:rPr>
+              <w:t>Action</w:t>
+            </w:r>
+          </w:p>
+        </w:tc>
+      </w:tr>
+      <w:tr>
+        <w:tc>
+          <w:tcPr>
+            <w:tcW w:type="dxa" w:w="2551"/>
+            <w:tcBorders>
+              <w:top w:val="single" w:sz="4" w:space="0" w:color="CCCCCC"/>
+              <w:left w:val="single" w:sz="4" w:space="0" w:color="CCCCCC"/>
+              <w:bottom w:val="single" w:sz="4" w:space="0" w:color="CCCCCC"/>
+              <w:right w:val="single" w:sz="4" w:space="0" w:color="CCCCCC"/>
+            </w:tcBorders>
+          </w:tcPr>
+          <w:p>
+            <w:r>
+              <w:rPr>
+                <w:rFonts w:ascii="Calibri" w:hAnsi="Calibri"/>
+                <w:b w:val="0"/>
+                <w:color w:val="1C1C1C"/>
+                <w:sz w:val="18"/>
+              </w:rPr>
+              <w:t>Biomechanics script</w:t>
+            </w:r>
+          </w:p>
+        </w:tc>
+        <w:tc>
+          <w:tcPr>
+            <w:tcW w:type="dxa" w:w="7087"/>
+            <w:shd w:val="clear" w:color="auto" w:fill="E0F4E8"/>
+            <w:tcBorders>
+              <w:top w:val="single" w:sz="4" w:space="0" w:color="CCCCCC"/>
+              <w:left w:val="single" w:sz="4" w:space="0" w:color="CCCCCC"/>
+              <w:bottom w:val="single" w:sz="4" w:space="0" w:color="CCCCCC"/>
+              <w:right w:val="single" w:sz="4" w:space="0" w:color="CCCCCC"/>
+            </w:tcBorders>
+          </w:tcPr>
+          <w:p>
+            <w:r>
+              <w:rPr>
+                <w:rFonts w:ascii="Calibri" w:hAnsi="Calibri"/>
+                <w:b w:val="0"/>
+                <w:color w:val="1A6E2E"/>
+                <w:sz w:val="18"/>
+              </w:rPr>
+              <w:t>stability_data fields remain null — correct as-is. No change.</w:t>
+            </w:r>
+          </w:p>
+        </w:tc>
+      </w:tr>
+      <w:tr>
+        <w:tc>
+          <w:tcPr>
+            <w:tcW w:type="dxa" w:w="2551"/>
+            <w:tcBorders>
+              <w:top w:val="single" w:sz="4" w:space="0" w:color="CCCCCC"/>
+              <w:left w:val="single" w:sz="4" w:space="0" w:color="CCCCCC"/>
+              <w:bottom w:val="single" w:sz="4" w:space="0" w:color="CCCCCC"/>
+              <w:right w:val="single" w:sz="4" w:space="0" w:color="CCCCCC"/>
+            </w:tcBorders>
+          </w:tcPr>
+          <w:p>
+            <w:r>
+              <w:rPr>
+                <w:rFonts w:ascii="Calibri" w:hAnsi="Calibri"/>
+                <w:b w:val="0"/>
+                <w:color w:val="1C1C1C"/>
+                <w:sz w:val="18"/>
+              </w:rPr>
+              <w:t>OpenCV image label</w:t>
+            </w:r>
+          </w:p>
+        </w:tc>
+        <w:tc>
+          <w:tcPr>
+            <w:tcW w:type="dxa" w:w="7087"/>
+            <w:shd w:val="clear" w:color="auto" w:fill="E0F4E8"/>
+            <w:tcBorders>
+              <w:top w:val="single" w:sz="4" w:space="0" w:color="CCCCCC"/>
+              <w:left w:val="single" w:sz="4" w:space="0" w:color="CCCCCC"/>
+              <w:bottom w:val="single" w:sz="4" w:space="0" w:color="CCCCCC"/>
+              <w:right w:val="single" w:sz="4" w:space="0" w:color="CCCCCC"/>
+            </w:tcBorders>
+          </w:tcPr>
+          <w:p>
+            <w:r>
+              <w:rPr>
+                <w:rFonts w:ascii="Calibri" w:hAnsi="Calibri"/>
+                <w:b w:val="0"/>
+                <w:color w:val="1A6E2E"/>
+                <w:sz w:val="18"/>
+              </w:rPr>
+              <w:t>No valgus label shown on side-camera images.</w:t>
+            </w:r>
+          </w:p>
+        </w:tc>
+      </w:tr>
+      <w:tr>
+        <w:tc>
+          <w:tcPr>
+            <w:tcW w:type="dxa" w:w="2551"/>
+            <w:tcBorders>
+              <w:top w:val="single" w:sz="4" w:space="0" w:color="CCCCCC"/>
+              <w:left w:val="single" w:sz="4" w:space="0" w:color="CCCCCC"/>
+              <w:bottom w:val="single" w:sz="4" w:space="0" w:color="CCCCCC"/>
+              <w:right w:val="single" w:sz="4" w:space="0" w:color="CCCCCC"/>
+            </w:tcBorders>
+          </w:tcPr>
+          <w:p>
+            <w:r>
+              <w:rPr>
+                <w:rFonts w:ascii="Calibri" w:hAnsi="Calibri"/>
+                <w:b w:val="0"/>
+                <w:color w:val="1C1C1C"/>
+                <w:sz w:val="18"/>
+              </w:rPr>
+              <w:t>Haiku coaching — RC1 confirmed</w:t>
+            </w:r>
+          </w:p>
+        </w:tc>
+        <w:tc>
+          <w:tcPr>
+            <w:tcW w:type="dxa" w:w="7087"/>
+            <w:tcBorders>
+              <w:top w:val="single" w:sz="4" w:space="0" w:color="CCCCCC"/>
+              <w:left w:val="single" w:sz="4" w:space="0" w:color="CCCCCC"/>
+              <w:bottom w:val="single" w:sz="4" w:space="0" w:color="CCCCCC"/>
+              <w:right w:val="single" w:sz="4" w:space="0" w:color="CCCCCC"/>
+            </w:tcBorders>
+          </w:tcPr>
+          <w:p>
+            <w:r>
+              <w:rPr>
+                <w:rFonts w:ascii="Calibri" w:hAnsi="Calibri"/>
+                <w:b w:val="0"/>
+                <w:color w:val="1C1C1C"/>
+                <w:sz w:val="18"/>
+              </w:rPr>
+              <w:t>If ankle restriction is confirmed (RC1), add to coaching: 'Ankle restriction at this level often causes knees to cave inward on the ascent. A front-camera session would confirm whether this is happening for you.'</w:t>
+            </w:r>
+          </w:p>
+        </w:tc>
+      </w:tr>
+      <w:tr>
+        <w:tc>
+          <w:tcPr>
+            <w:tcW w:type="dxa" w:w="2551"/>
+            <w:tcBorders>
+              <w:top w:val="single" w:sz="4" w:space="0" w:color="CCCCCC"/>
+              <w:left w:val="single" w:sz="4" w:space="0" w:color="CCCCCC"/>
+              <w:bottom w:val="single" w:sz="4" w:space="0" w:color="CCCCCC"/>
+              <w:right w:val="single" w:sz="4" w:space="0" w:color="CCCCCC"/>
+            </w:tcBorders>
+          </w:tcPr>
+          <w:p>
+            <w:r>
+              <w:rPr>
+                <w:rFonts w:ascii="Calibri" w:hAnsi="Calibri"/>
+                <w:b w:val="0"/>
+                <w:color w:val="1C1C1C"/>
+                <w:sz w:val="18"/>
+              </w:rPr>
+              <w:t>Haiku coaching — no RC1</w:t>
+            </w:r>
+          </w:p>
+        </w:tc>
+        <w:tc>
+          <w:tcPr>
+            <w:tcW w:type="dxa" w:w="7087"/>
+            <w:tcBorders>
+              <w:top w:val="single" w:sz="4" w:space="0" w:color="CCCCCC"/>
+              <w:left w:val="single" w:sz="4" w:space="0" w:color="CCCCCC"/>
+              <w:bottom w:val="single" w:sz="4" w:space="0" w:color="CCCCCC"/>
+              <w:right w:val="single" w:sz="4" w:space="0" w:color="CCCCCC"/>
+            </w:tcBorders>
+          </w:tcPr>
+          <w:p>
+            <w:r>
+              <w:rPr>
+                <w:rFonts w:ascii="Calibri" w:hAnsi="Calibri"/>
+                <w:b w:val="0"/>
+                <w:color w:val="1C1C1C"/>
+                <w:sz w:val="18"/>
+              </w:rPr>
+              <w:t>Do not mention valgus. No data, no comment.</w:t>
+            </w:r>
+          </w:p>
+        </w:tc>
+      </w:tr>
+      <w:tr>
+        <w:tc>
+          <w:tcPr>
+            <w:tcW w:type="dxa" w:w="2551"/>
+            <w:tcBorders>
+              <w:top w:val="single" w:sz="4" w:space="0" w:color="CCCCCC"/>
+              <w:left w:val="single" w:sz="4" w:space="0" w:color="CCCCCC"/>
+              <w:bottom w:val="single" w:sz="4" w:space="0" w:color="CCCCCC"/>
+              <w:right w:val="single" w:sz="4" w:space="0" w:color="CCCCCC"/>
+            </w:tcBorders>
+          </w:tcPr>
+          <w:p>
+            <w:r>
+              <w:rPr>
+                <w:rFonts w:ascii="Calibri" w:hAnsi="Calibri"/>
+                <w:b w:val="0"/>
+                <w:color w:val="1C1C1C"/>
+                <w:sz w:val="18"/>
+              </w:rPr>
+              <w:t>Results screen note</w:t>
+            </w:r>
+          </w:p>
+        </w:tc>
+        <w:tc>
+          <w:tcPr>
+            <w:tcW w:type="dxa" w:w="7087"/>
+            <w:tcBorders>
+              <w:top w:val="single" w:sz="4" w:space="0" w:color="CCCCCC"/>
+              <w:left w:val="single" w:sz="4" w:space="0" w:color="CCCCCC"/>
+              <w:bottom w:val="single" w:sz="4" w:space="0" w:color="CCCCCC"/>
+              <w:right w:val="single" w:sz="4" w:space="0" w:color="CCCCCC"/>
+            </w:tcBorders>
+          </w:tcPr>
+          <w:p>
+            <w:r>
+              <w:rPr>
+                <w:rFonts w:ascii="Calibri" w:hAnsi="Calibri"/>
+                <w:b w:val="0"/>
+                <w:color w:val="1C1C1C"/>
+                <w:sz w:val="18"/>
+              </w:rPr>
+              <w:t>Show inline note: 'Knee tracking not assessed — requires front-camera footage.'</w:t>
+            </w:r>
+          </w:p>
+        </w:tc>
+      </w:tr>
+    </w:tbl>
+    <w:p>
+      <w:pPr>
+        <w:spacing w:after="80"/>
+      </w:pPr>
+    </w:p>
+    <w:tbl>
+      <w:tblPr>
+        <w:tblStyle w:val="TableGrid"/>
+        <w:tblW w:type="auto" w:w="0"/>
+        <w:tblLook w:firstColumn="1" w:firstRow="1" w:lastColumn="0" w:lastRow="0" w:noHBand="0" w:noVBand="1" w:val="04A0"/>
+      </w:tblPr>
+      <w:tblGrid>
+        <w:gridCol w:w="9746"/>
+      </w:tblGrid>
+      <w:tr>
+        <w:tc>
+          <w:tcPr>
+            <w:tcW w:type="dxa" w:w="9746"/>
+            <w:shd w:val="clear" w:color="auto" w:fill="FFF3CD"/>
+            <w:tcBorders>
+              <w:top w:val="single" w:sz="6" w:space="0" w:color="AAAAAA"/>
+              <w:left w:val="single" w:sz="6" w:space="0" w:color="AAAAAA"/>
+              <w:bottom w:val="single" w:sz="6" w:space="0" w:color="AAAAAA"/>
+              <w:right w:val="single" w:sz="6" w:space="0" w:color="AAAAAA"/>
+            </w:tcBorders>
+          </w:tcPr>
+          <w:p>
+            <w:pPr>
+              <w:spacing w:before="40" w:after="40"/>
+            </w:pPr>
+            <w:r>
+              <w:rPr>
+                <w:rFonts w:ascii="Calibri" w:hAnsi="Calibri"/>
+                <w:b/>
+                <w:color w:val="C07000"/>
+                <w:sz w:val="20"/>
+              </w:rPr>
+              <w:t xml:space="preserve">Action for system prompt v2.0:  </w:t>
+            </w:r>
+            <w:r>
+              <w:rPr>
+                <w:rFonts w:ascii="Calibri" w:hAnsi="Calibri"/>
+                <w:b w:val="0"/>
+                <w:color w:val="1C1C1C"/>
+                <w:sz w:val="20"/>
+              </w:rPr>
+              <w:t>Add to [COACHING LANGUAGE REFERENCE] or RC2 section:</w:t>
+              <w:br/>
+              <w:t>'Side camera sessions: do not score or comment on valgus — stability_data will be null. Exception: if RC1 (ankle restriction) is confirmed, note valgus as a potential downstream risk in coaching text only, without a severity score.'</w:t>
+            </w:r>
+          </w:p>
+        </w:tc>
+      </w:tr>
+    </w:tbl>
+    <w:p>
+      <w:pPr>
+        <w:spacing w:after="80"/>
+      </w:pPr>
+    </w:p>
+    <w:p>
+      <w:pPr>
+        <w:spacing w:before="240"/>
+      </w:pPr>
+      <w:r>
+        <w:rPr>
+          <w:rFonts w:ascii="Calibri" w:hAnsi="Calibri"/>
+          <w:b w:val="0"/>
+          <w:color w:val="555555"/>
+          <w:sz w:val="16"/>
+        </w:rPr>
+        <w:t>Kinetic  ·  Threshold Alignment Brief  ·  Valgus Side Camera  ·  May 2026</w:t>
       </w:r>
     </w:p>
     <w:sectPr>

</xml_diff>